<commit_message>
Atualizações na documentação do projeto.
</commit_message>
<xml_diff>
--- a/docs/Quando atualizar os secrets do Github.docx
+++ b/docs/Quando atualizar os secrets do Github.docx
@@ -7,7 +7,23 @@
         <w:pStyle w:val="Ttulo1"/>
       </w:pPr>
       <w:r>
-        <w:t>Quando Atualizar os Secrets do GITHub.</w:t>
+        <w:t xml:space="preserve">Quando Atualizar os </w:t>
+      </w:r>
+      <w:proofErr w:type="spellStart"/>
+      <w:r>
+        <w:t>Secrets</w:t>
+      </w:r>
+      <w:proofErr w:type="spellEnd"/>
+      <w:r>
+        <w:t xml:space="preserve"> do </w:t>
+      </w:r>
+      <w:proofErr w:type="spellStart"/>
+      <w:r>
+        <w:t>GITHub</w:t>
+      </w:r>
+      <w:proofErr w:type="spellEnd"/>
+      <w:r>
+        <w:t>.</w:t>
       </w:r>
     </w:p>
     <w:p/>
@@ -20,11 +36,33 @@
       <w:r>
         <w:t>Depois de rodar o comando “</w:t>
       </w:r>
+      <w:proofErr w:type="spellStart"/>
       <w:r>
         <w:rPr>
           <w:rFonts w:ascii="Arial Narrow" w:hAnsi="Arial Narrow"/>
         </w:rPr>
-        <w:t>terraform destroy”</w:t>
+        <w:t>terraform</w:t>
+      </w:r>
+      <w:proofErr w:type="spellEnd"/>
+      <w:r>
+        <w:rPr>
+          <w:rFonts w:ascii="Arial Narrow" w:hAnsi="Arial Narrow"/>
+        </w:rPr>
+        <w:t xml:space="preserve"> </w:t>
+      </w:r>
+      <w:proofErr w:type="spellStart"/>
+      <w:r>
+        <w:rPr>
+          <w:rFonts w:ascii="Arial Narrow" w:hAnsi="Arial Narrow"/>
+        </w:rPr>
+        <w:t>destroy</w:t>
+      </w:r>
+      <w:proofErr w:type="spellEnd"/>
+      <w:r>
+        <w:rPr>
+          <w:rFonts w:ascii="Arial Narrow" w:hAnsi="Arial Narrow"/>
+        </w:rPr>
+        <w:t>”</w:t>
       </w:r>
     </w:p>
     <w:p>
@@ -52,18 +90,76 @@
         </w:rPr>
         <w:t>Então depois de reconstruir com o comando “</w:t>
       </w:r>
+      <w:proofErr w:type="spellStart"/>
       <w:r>
         <w:rPr>
           <w:rFonts w:ascii="Arial Narrow" w:hAnsi="Arial Narrow" w:cstheme="minorHAnsi"/>
         </w:rPr>
-        <w:t xml:space="preserve">terraform apply” </w:t>
-      </w:r>
-      <w:r>
-        <w:rPr>
-          <w:rFonts w:cstheme="minorHAnsi"/>
-        </w:rPr>
-        <w:t>os recursos serão criados e novos IDs serão criados e alguns precisarão ser atualizados nos Secrets do GITHub</w:t>
-      </w:r>
+        <w:t>terraform</w:t>
+      </w:r>
+      <w:proofErr w:type="spellEnd"/>
+      <w:r>
+        <w:rPr>
+          <w:rFonts w:ascii="Arial Narrow" w:hAnsi="Arial Narrow" w:cstheme="minorHAnsi"/>
+        </w:rPr>
+        <w:t xml:space="preserve"> </w:t>
+      </w:r>
+      <w:proofErr w:type="spellStart"/>
+      <w:r>
+        <w:rPr>
+          <w:rFonts w:ascii="Arial Narrow" w:hAnsi="Arial Narrow" w:cstheme="minorHAnsi"/>
+        </w:rPr>
+        <w:t>apply</w:t>
+      </w:r>
+      <w:proofErr w:type="spellEnd"/>
+      <w:r>
+        <w:rPr>
+          <w:rFonts w:ascii="Arial Narrow" w:hAnsi="Arial Narrow" w:cstheme="minorHAnsi"/>
+        </w:rPr>
+        <w:t xml:space="preserve">” </w:t>
+      </w:r>
+      <w:r>
+        <w:rPr>
+          <w:rFonts w:cstheme="minorHAnsi"/>
+        </w:rPr>
+        <w:t xml:space="preserve">os recursos serão criados e novos </w:t>
+      </w:r>
+      <w:proofErr w:type="spellStart"/>
+      <w:r>
+        <w:rPr>
+          <w:rFonts w:cstheme="minorHAnsi"/>
+        </w:rPr>
+        <w:t>IDs</w:t>
+      </w:r>
+      <w:proofErr w:type="spellEnd"/>
+      <w:r>
+        <w:rPr>
+          <w:rFonts w:cstheme="minorHAnsi"/>
+        </w:rPr>
+        <w:t xml:space="preserve"> serão criados e alguns precisarão ser atualizados nos </w:t>
+      </w:r>
+      <w:proofErr w:type="spellStart"/>
+      <w:r>
+        <w:rPr>
+          <w:rFonts w:cstheme="minorHAnsi"/>
+        </w:rPr>
+        <w:t>Secrets</w:t>
+      </w:r>
+      <w:proofErr w:type="spellEnd"/>
+      <w:r>
+        <w:rPr>
+          <w:rFonts w:cstheme="minorHAnsi"/>
+        </w:rPr>
+        <w:t xml:space="preserve"> do </w:t>
+      </w:r>
+      <w:proofErr w:type="spellStart"/>
+      <w:r>
+        <w:rPr>
+          <w:rFonts w:cstheme="minorHAnsi"/>
+        </w:rPr>
+        <w:t>GITHub</w:t>
+      </w:r>
+      <w:proofErr w:type="spellEnd"/>
       <w:r>
         <w:rPr>
           <w:rFonts w:cstheme="minorHAnsi"/>
@@ -92,6 +188,7 @@
       <w:r>
         <w:rPr>
           <w:rFonts w:cstheme="minorHAnsi"/>
+          <w:noProof/>
         </w:rPr>
         <w:drawing>
           <wp:inline distT="0" distB="0" distL="0" distR="0" wp14:anchorId="41FF1EC7" wp14:editId="02948674">
@@ -109,7 +206,7 @@
                     <pic:cNvPicPr/>
                   </pic:nvPicPr>
                   <pic:blipFill>
-                    <a:blip r:embed="rId4"/>
+                    <a:blip r:embed="rId5"/>
                     <a:stretch>
                       <a:fillRect/>
                     </a:stretch>
@@ -130,6 +227,3117 @@
         </w:drawing>
       </w:r>
     </w:p>
+    <w:p>
+      <w:pPr>
+        <w:rPr>
+          <w:rFonts w:cstheme="minorHAnsi"/>
+        </w:rPr>
+      </w:pPr>
+    </w:p>
+    <w:p>
+      <w:pPr>
+        <w:pStyle w:val="Ttulo2"/>
+        <w:shd w:val="clear" w:color="auto" w:fill="1E2127"/>
+        <w:spacing w:before="300" w:after="150"/>
+        <w:rPr>
+          <w:rFonts w:ascii="Segoe UI" w:hAnsi="Segoe UI" w:cs="Segoe UI"/>
+          <w:color w:val="7B88A1"/>
+          <w:sz w:val="31"/>
+          <w:szCs w:val="31"/>
+        </w:rPr>
+      </w:pPr>
+      <w:r>
+        <w:rPr>
+          <w:rFonts w:ascii="Segoe UI" w:hAnsi="Segoe UI" w:cs="Segoe UI"/>
+          <w:color w:val="7B88A1"/>
+          <w:sz w:val="31"/>
+          <w:szCs w:val="31"/>
+        </w:rPr>
+        <w:t>Checklist rápido pós-</w:t>
+      </w:r>
+      <w:proofErr w:type="spellStart"/>
+      <w:r>
+        <w:rPr>
+          <w:rStyle w:val="CdigoHTML"/>
+          <w:rFonts w:ascii="Consolas" w:eastAsiaTheme="majorEastAsia" w:hAnsi="Consolas"/>
+          <w:color w:val="7B88A1"/>
+          <w:sz w:val="28"/>
+          <w:szCs w:val="28"/>
+        </w:rPr>
+        <w:t>apply</w:t>
+      </w:r>
+      <w:proofErr w:type="spellEnd"/>
+    </w:p>
+    <w:p>
+      <w:pPr>
+        <w:pStyle w:val="py-1"/>
+        <w:numPr>
+          <w:ilvl w:val="0"/>
+          <w:numId w:val="1"/>
+        </w:numPr>
+        <w:shd w:val="clear" w:color="auto" w:fill="1E2127"/>
+        <w:rPr>
+          <w:rFonts w:ascii="Segoe UI" w:hAnsi="Segoe UI" w:cs="Segoe UI"/>
+          <w:color w:val="7B88A1"/>
+          <w:sz w:val="20"/>
+          <w:szCs w:val="20"/>
+        </w:rPr>
+      </w:pPr>
+      <w:r>
+        <w:rPr>
+          <w:rStyle w:val="CdigoHTML"/>
+          <w:rFonts w:ascii="Consolas" w:hAnsi="Consolas"/>
+          <w:color w:val="7B88A1"/>
+          <w:sz w:val="18"/>
+          <w:szCs w:val="18"/>
+        </w:rPr>
+        <w:t>AWS_ROLE_ARN</w:t>
+      </w:r>
+      <w:r>
+        <w:rPr>
+          <w:rFonts w:ascii="Segoe UI" w:hAnsi="Segoe UI" w:cs="Segoe UI"/>
+          <w:color w:val="7B88A1"/>
+          <w:sz w:val="20"/>
+          <w:szCs w:val="20"/>
+        </w:rPr>
+        <w:t> ← </w:t>
+      </w:r>
+      <w:proofErr w:type="spellStart"/>
+      <w:r>
+        <w:rPr>
+          <w:rStyle w:val="CdigoHTML"/>
+          <w:rFonts w:ascii="Consolas" w:hAnsi="Consolas"/>
+          <w:color w:val="7B88A1"/>
+          <w:sz w:val="18"/>
+          <w:szCs w:val="18"/>
+        </w:rPr>
+        <w:t>terraform</w:t>
+      </w:r>
+      <w:proofErr w:type="spellEnd"/>
+      <w:r>
+        <w:rPr>
+          <w:rStyle w:val="CdigoHTML"/>
+          <w:rFonts w:ascii="Consolas" w:hAnsi="Consolas"/>
+          <w:color w:val="7B88A1"/>
+          <w:sz w:val="18"/>
+          <w:szCs w:val="18"/>
+        </w:rPr>
+        <w:t xml:space="preserve"> output -</w:t>
+      </w:r>
+      <w:proofErr w:type="spellStart"/>
+      <w:r>
+        <w:rPr>
+          <w:rStyle w:val="CdigoHTML"/>
+          <w:rFonts w:ascii="Consolas" w:hAnsi="Consolas"/>
+          <w:color w:val="7B88A1"/>
+          <w:sz w:val="18"/>
+          <w:szCs w:val="18"/>
+        </w:rPr>
+        <w:t>raw</w:t>
+      </w:r>
+      <w:proofErr w:type="spellEnd"/>
+      <w:r>
+        <w:rPr>
+          <w:rStyle w:val="CdigoHTML"/>
+          <w:rFonts w:ascii="Consolas" w:hAnsi="Consolas"/>
+          <w:color w:val="7B88A1"/>
+          <w:sz w:val="18"/>
+          <w:szCs w:val="18"/>
+        </w:rPr>
+        <w:t xml:space="preserve"> </w:t>
+      </w:r>
+      <w:proofErr w:type="spellStart"/>
+      <w:r>
+        <w:rPr>
+          <w:rStyle w:val="CdigoHTML"/>
+          <w:rFonts w:ascii="Consolas" w:hAnsi="Consolas"/>
+          <w:color w:val="7B88A1"/>
+          <w:sz w:val="18"/>
+          <w:szCs w:val="18"/>
+        </w:rPr>
+        <w:t>github_actions_role_arn</w:t>
+      </w:r>
+      <w:proofErr w:type="spellEnd"/>
+    </w:p>
+    <w:p>
+      <w:pPr>
+        <w:pStyle w:val="py-1"/>
+        <w:numPr>
+          <w:ilvl w:val="0"/>
+          <w:numId w:val="1"/>
+        </w:numPr>
+        <w:shd w:val="clear" w:color="auto" w:fill="1E2127"/>
+        <w:rPr>
+          <w:rFonts w:ascii="Segoe UI" w:hAnsi="Segoe UI" w:cs="Segoe UI"/>
+          <w:color w:val="7B88A1"/>
+          <w:sz w:val="20"/>
+          <w:szCs w:val="20"/>
+        </w:rPr>
+      </w:pPr>
+      <w:r>
+        <w:rPr>
+          <w:rStyle w:val="CdigoHTML"/>
+          <w:rFonts w:ascii="Consolas" w:hAnsi="Consolas"/>
+          <w:color w:val="7B88A1"/>
+          <w:sz w:val="18"/>
+          <w:szCs w:val="18"/>
+        </w:rPr>
+        <w:t>ECR_REPOSITORY_NAME</w:t>
+      </w:r>
+      <w:r>
+        <w:rPr>
+          <w:rFonts w:ascii="Segoe UI" w:hAnsi="Segoe UI" w:cs="Segoe UI"/>
+          <w:color w:val="7B88A1"/>
+          <w:sz w:val="20"/>
+          <w:szCs w:val="20"/>
+        </w:rPr>
+        <w:t> ← sufixo de </w:t>
+      </w:r>
+      <w:proofErr w:type="spellStart"/>
+      <w:r>
+        <w:rPr>
+          <w:rStyle w:val="CdigoHTML"/>
+          <w:rFonts w:ascii="Consolas" w:hAnsi="Consolas"/>
+          <w:color w:val="7B88A1"/>
+          <w:sz w:val="18"/>
+          <w:szCs w:val="18"/>
+        </w:rPr>
+        <w:t>ecr_repository_url</w:t>
+      </w:r>
+      <w:proofErr w:type="spellEnd"/>
+      <w:r>
+        <w:rPr>
+          <w:rFonts w:ascii="Segoe UI" w:hAnsi="Segoe UI" w:cs="Segoe UI"/>
+          <w:color w:val="7B88A1"/>
+          <w:sz w:val="20"/>
+          <w:szCs w:val="20"/>
+        </w:rPr>
+        <w:t> ou </w:t>
+      </w:r>
+      <w:proofErr w:type="spellStart"/>
+      <w:r>
+        <w:rPr>
+          <w:rStyle w:val="CdigoHTML"/>
+          <w:rFonts w:ascii="Consolas" w:hAnsi="Consolas"/>
+          <w:color w:val="7B88A1"/>
+          <w:sz w:val="18"/>
+          <w:szCs w:val="18"/>
+        </w:rPr>
+        <w:t>yolo</w:t>
+      </w:r>
+      <w:proofErr w:type="spellEnd"/>
+      <w:r>
+        <w:rPr>
+          <w:rStyle w:val="CdigoHTML"/>
+          <w:rFonts w:ascii="Consolas" w:hAnsi="Consolas"/>
+          <w:color w:val="7B88A1"/>
+          <w:sz w:val="18"/>
+          <w:szCs w:val="18"/>
+        </w:rPr>
+        <w:t>-</w:t>
+      </w:r>
+      <w:proofErr w:type="spellStart"/>
+      <w:r>
+        <w:rPr>
+          <w:rStyle w:val="CdigoHTML"/>
+          <w:rFonts w:ascii="Consolas" w:hAnsi="Consolas"/>
+          <w:color w:val="7B88A1"/>
+          <w:sz w:val="18"/>
+          <w:szCs w:val="18"/>
+        </w:rPr>
+        <w:t>violence</w:t>
+      </w:r>
+      <w:proofErr w:type="spellEnd"/>
+      <w:r>
+        <w:rPr>
+          <w:rStyle w:val="CdigoHTML"/>
+          <w:rFonts w:ascii="Consolas" w:hAnsi="Consolas"/>
+          <w:color w:val="7B88A1"/>
+          <w:sz w:val="18"/>
+          <w:szCs w:val="18"/>
+        </w:rPr>
+        <w:t>-</w:t>
+      </w:r>
+      <w:proofErr w:type="spellStart"/>
+      <w:r>
+        <w:rPr>
+          <w:rStyle w:val="CdigoHTML"/>
+          <w:rFonts w:ascii="Consolas" w:hAnsi="Consolas"/>
+          <w:color w:val="7B88A1"/>
+          <w:sz w:val="18"/>
+          <w:szCs w:val="18"/>
+        </w:rPr>
+        <w:t>prod</w:t>
+      </w:r>
+      <w:proofErr w:type="spellEnd"/>
+      <w:r>
+        <w:rPr>
+          <w:rStyle w:val="CdigoHTML"/>
+          <w:rFonts w:ascii="Consolas" w:hAnsi="Consolas"/>
+          <w:color w:val="7B88A1"/>
+          <w:sz w:val="18"/>
+          <w:szCs w:val="18"/>
+        </w:rPr>
+        <w:t>-app</w:t>
+      </w:r>
+    </w:p>
+    <w:p>
+      <w:pPr>
+        <w:pStyle w:val="py-1"/>
+        <w:numPr>
+          <w:ilvl w:val="0"/>
+          <w:numId w:val="1"/>
+        </w:numPr>
+        <w:shd w:val="clear" w:color="auto" w:fill="1E2127"/>
+        <w:rPr>
+          <w:rFonts w:ascii="Segoe UI" w:hAnsi="Segoe UI" w:cs="Segoe UI"/>
+          <w:color w:val="7B88A1"/>
+          <w:sz w:val="20"/>
+          <w:szCs w:val="20"/>
+        </w:rPr>
+      </w:pPr>
+      <w:r>
+        <w:rPr>
+          <w:rStyle w:val="CdigoHTML"/>
+          <w:rFonts w:ascii="Consolas" w:hAnsi="Consolas"/>
+          <w:color w:val="7B88A1"/>
+          <w:sz w:val="18"/>
+          <w:szCs w:val="18"/>
+        </w:rPr>
+        <w:t>ECS_CLUSTER_NAME</w:t>
+      </w:r>
+      <w:r>
+        <w:rPr>
+          <w:rFonts w:ascii="Segoe UI" w:hAnsi="Segoe UI" w:cs="Segoe UI"/>
+          <w:color w:val="7B88A1"/>
+          <w:sz w:val="20"/>
+          <w:szCs w:val="20"/>
+        </w:rPr>
+        <w:t> ← </w:t>
+      </w:r>
+      <w:proofErr w:type="spellStart"/>
+      <w:r>
+        <w:rPr>
+          <w:rStyle w:val="CdigoHTML"/>
+          <w:rFonts w:ascii="Consolas" w:hAnsi="Consolas"/>
+          <w:color w:val="7B88A1"/>
+          <w:sz w:val="18"/>
+          <w:szCs w:val="18"/>
+        </w:rPr>
+        <w:t>ecs_cluster_name</w:t>
+      </w:r>
+      <w:proofErr w:type="spellEnd"/>
+    </w:p>
+    <w:p>
+      <w:pPr>
+        <w:pStyle w:val="py-1"/>
+        <w:numPr>
+          <w:ilvl w:val="0"/>
+          <w:numId w:val="1"/>
+        </w:numPr>
+        <w:shd w:val="clear" w:color="auto" w:fill="1E2127"/>
+        <w:rPr>
+          <w:rFonts w:ascii="Segoe UI" w:hAnsi="Segoe UI" w:cs="Segoe UI"/>
+          <w:color w:val="7B88A1"/>
+          <w:sz w:val="20"/>
+          <w:szCs w:val="20"/>
+        </w:rPr>
+      </w:pPr>
+      <w:r>
+        <w:rPr>
+          <w:rStyle w:val="CdigoHTML"/>
+          <w:rFonts w:ascii="Consolas" w:hAnsi="Consolas"/>
+          <w:color w:val="7B88A1"/>
+          <w:sz w:val="18"/>
+          <w:szCs w:val="18"/>
+        </w:rPr>
+        <w:t>ECS_TASK_DEFINITION_FAMILY</w:t>
+      </w:r>
+      <w:r>
+        <w:rPr>
+          <w:rFonts w:ascii="Segoe UI" w:hAnsi="Segoe UI" w:cs="Segoe UI"/>
+          <w:color w:val="7B88A1"/>
+          <w:sz w:val="20"/>
+          <w:szCs w:val="20"/>
+        </w:rPr>
+        <w:t> ← </w:t>
+      </w:r>
+      <w:proofErr w:type="spellStart"/>
+      <w:r>
+        <w:rPr>
+          <w:rStyle w:val="CdigoHTML"/>
+          <w:rFonts w:ascii="Consolas" w:hAnsi="Consolas"/>
+          <w:color w:val="7B88A1"/>
+          <w:sz w:val="18"/>
+          <w:szCs w:val="18"/>
+        </w:rPr>
+        <w:t>ecs_task_definition_family</w:t>
+      </w:r>
+      <w:proofErr w:type="spellEnd"/>
+    </w:p>
+    <w:p>
+      <w:pPr>
+        <w:pStyle w:val="py-1"/>
+        <w:numPr>
+          <w:ilvl w:val="0"/>
+          <w:numId w:val="1"/>
+        </w:numPr>
+        <w:shd w:val="clear" w:color="auto" w:fill="1E2127"/>
+        <w:rPr>
+          <w:rFonts w:ascii="Segoe UI" w:hAnsi="Segoe UI" w:cs="Segoe UI"/>
+          <w:color w:val="7B88A1"/>
+          <w:sz w:val="20"/>
+          <w:szCs w:val="20"/>
+        </w:rPr>
+      </w:pPr>
+      <w:r>
+        <w:rPr>
+          <w:rStyle w:val="CdigoHTML"/>
+          <w:rFonts w:ascii="Consolas" w:hAnsi="Consolas"/>
+          <w:color w:val="7B88A1"/>
+          <w:sz w:val="18"/>
+          <w:szCs w:val="18"/>
+        </w:rPr>
+        <w:t>ECS_CONTAINER_NAME</w:t>
+      </w:r>
+      <w:r>
+        <w:rPr>
+          <w:rFonts w:ascii="Segoe UI" w:hAnsi="Segoe UI" w:cs="Segoe UI"/>
+          <w:color w:val="7B88A1"/>
+          <w:sz w:val="20"/>
+          <w:szCs w:val="20"/>
+        </w:rPr>
+        <w:t> ← </w:t>
+      </w:r>
+      <w:r>
+        <w:rPr>
+          <w:rStyle w:val="CdigoHTML"/>
+          <w:rFonts w:ascii="Consolas" w:hAnsi="Consolas"/>
+          <w:color w:val="7B88A1"/>
+          <w:sz w:val="18"/>
+          <w:szCs w:val="18"/>
+        </w:rPr>
+        <w:t>ecs_task_container_name</w:t>
+      </w:r>
+      <w:r>
+        <w:rPr>
+          <w:rFonts w:ascii="Segoe UI" w:hAnsi="Segoe UI" w:cs="Segoe UI"/>
+          <w:color w:val="7B88A1"/>
+          <w:sz w:val="20"/>
+          <w:szCs w:val="20"/>
+        </w:rPr>
+        <w:t> (esperado: </w:t>
+      </w:r>
+      <w:r>
+        <w:rPr>
+          <w:rStyle w:val="CdigoHTML"/>
+          <w:rFonts w:ascii="Consolas" w:hAnsi="Consolas"/>
+          <w:color w:val="7B88A1"/>
+          <w:sz w:val="18"/>
+          <w:szCs w:val="18"/>
+        </w:rPr>
+        <w:t>yolo-violence</w:t>
+      </w:r>
+      <w:r>
+        <w:rPr>
+          <w:rFonts w:ascii="Segoe UI" w:hAnsi="Segoe UI" w:cs="Segoe UI"/>
+          <w:color w:val="7B88A1"/>
+          <w:sz w:val="20"/>
+          <w:szCs w:val="20"/>
+        </w:rPr>
+        <w:t>)</w:t>
+      </w:r>
+    </w:p>
+    <w:p>
+      <w:pPr>
+        <w:pStyle w:val="py-1"/>
+        <w:numPr>
+          <w:ilvl w:val="0"/>
+          <w:numId w:val="1"/>
+        </w:numPr>
+        <w:shd w:val="clear" w:color="auto" w:fill="1E2127"/>
+        <w:rPr>
+          <w:rFonts w:ascii="Segoe UI" w:hAnsi="Segoe UI" w:cs="Segoe UI"/>
+          <w:color w:val="7B88A1"/>
+          <w:sz w:val="20"/>
+          <w:szCs w:val="20"/>
+        </w:rPr>
+      </w:pPr>
+      <w:r>
+        <w:rPr>
+          <w:rStyle w:val="CdigoHTML"/>
+          <w:rFonts w:ascii="Consolas" w:hAnsi="Consolas"/>
+          <w:color w:val="7B88A1"/>
+          <w:sz w:val="18"/>
+          <w:szCs w:val="18"/>
+        </w:rPr>
+        <w:t>ECS_SUBNET_IDS</w:t>
+      </w:r>
+      <w:r>
+        <w:rPr>
+          <w:rFonts w:ascii="Segoe UI" w:hAnsi="Segoe UI" w:cs="Segoe UI"/>
+          <w:color w:val="7B88A1"/>
+          <w:sz w:val="20"/>
+          <w:szCs w:val="20"/>
+        </w:rPr>
+        <w:t> ← </w:t>
+      </w:r>
+      <w:proofErr w:type="spellStart"/>
+      <w:r>
+        <w:rPr>
+          <w:rStyle w:val="CdigoHTML"/>
+          <w:rFonts w:ascii="Consolas" w:hAnsi="Consolas"/>
+          <w:color w:val="7B88A1"/>
+          <w:sz w:val="18"/>
+          <w:szCs w:val="18"/>
+        </w:rPr>
+        <w:t>default_subnet_ids</w:t>
+      </w:r>
+      <w:proofErr w:type="spellEnd"/>
+      <w:r>
+        <w:rPr>
+          <w:rFonts w:ascii="Segoe UI" w:hAnsi="Segoe UI" w:cs="Segoe UI"/>
+          <w:color w:val="7B88A1"/>
+          <w:sz w:val="20"/>
+          <w:szCs w:val="20"/>
+        </w:rPr>
+        <w:t> em CSV</w:t>
+      </w:r>
+    </w:p>
+    <w:p>
+      <w:pPr>
+        <w:pStyle w:val="py-1"/>
+        <w:numPr>
+          <w:ilvl w:val="0"/>
+          <w:numId w:val="1"/>
+        </w:numPr>
+        <w:shd w:val="clear" w:color="auto" w:fill="1E2127"/>
+        <w:rPr>
+          <w:rFonts w:ascii="Segoe UI" w:hAnsi="Segoe UI" w:cs="Segoe UI"/>
+          <w:color w:val="7B88A1"/>
+          <w:sz w:val="20"/>
+          <w:szCs w:val="20"/>
+        </w:rPr>
+      </w:pPr>
+      <w:r>
+        <w:rPr>
+          <w:rStyle w:val="CdigoHTML"/>
+          <w:rFonts w:ascii="Consolas" w:hAnsi="Consolas"/>
+          <w:color w:val="7B88A1"/>
+          <w:sz w:val="18"/>
+          <w:szCs w:val="18"/>
+        </w:rPr>
+        <w:t>ECS_SECURITY_GROUP_ID</w:t>
+      </w:r>
+      <w:r>
+        <w:rPr>
+          <w:rFonts w:ascii="Segoe UI" w:hAnsi="Segoe UI" w:cs="Segoe UI"/>
+          <w:color w:val="7B88A1"/>
+          <w:sz w:val="20"/>
+          <w:szCs w:val="20"/>
+        </w:rPr>
+        <w:t> ← </w:t>
+      </w:r>
+      <w:proofErr w:type="spellStart"/>
+      <w:r>
+        <w:rPr>
+          <w:rStyle w:val="CdigoHTML"/>
+          <w:rFonts w:ascii="Consolas" w:hAnsi="Consolas"/>
+          <w:color w:val="7B88A1"/>
+          <w:sz w:val="18"/>
+          <w:szCs w:val="18"/>
+        </w:rPr>
+        <w:t>ecs_task_security_group_id</w:t>
+      </w:r>
+      <w:proofErr w:type="spellEnd"/>
+    </w:p>
+    <w:p>
+      <w:pPr>
+        <w:pStyle w:val="NormalWeb"/>
+        <w:shd w:val="clear" w:color="auto" w:fill="1E2127"/>
+        <w:spacing w:before="90" w:beforeAutospacing="0" w:after="0" w:afterAutospacing="0"/>
+        <w:rPr>
+          <w:rFonts w:ascii="Segoe UI" w:hAnsi="Segoe UI" w:cs="Segoe UI"/>
+          <w:color w:val="7B88A1"/>
+          <w:sz w:val="20"/>
+          <w:szCs w:val="20"/>
+        </w:rPr>
+      </w:pPr>
+      <w:r>
+        <w:rPr>
+          <w:rFonts w:ascii="Segoe UI" w:hAnsi="Segoe UI" w:cs="Segoe UI"/>
+          <w:color w:val="7B88A1"/>
+          <w:sz w:val="20"/>
+          <w:szCs w:val="20"/>
+        </w:rPr>
+        <w:t>Confirme também que </w:t>
+      </w:r>
+      <w:proofErr w:type="spellStart"/>
+      <w:r>
+        <w:rPr>
+          <w:rStyle w:val="CdigoHTML"/>
+          <w:rFonts w:ascii="Consolas" w:hAnsi="Consolas"/>
+          <w:color w:val="7B88A1"/>
+          <w:sz w:val="18"/>
+          <w:szCs w:val="18"/>
+        </w:rPr>
+        <w:t>github_repository</w:t>
+      </w:r>
+      <w:proofErr w:type="spellEnd"/>
+      <w:r>
+        <w:rPr>
+          <w:rFonts w:ascii="Segoe UI" w:hAnsi="Segoe UI" w:cs="Segoe UI"/>
+          <w:color w:val="7B88A1"/>
+          <w:sz w:val="20"/>
+          <w:szCs w:val="20"/>
+        </w:rPr>
+        <w:t xml:space="preserve"> no </w:t>
+      </w:r>
+      <w:proofErr w:type="spellStart"/>
+      <w:r>
+        <w:rPr>
+          <w:rFonts w:ascii="Segoe UI" w:hAnsi="Segoe UI" w:cs="Segoe UI"/>
+          <w:color w:val="7B88A1"/>
+          <w:sz w:val="20"/>
+          <w:szCs w:val="20"/>
+        </w:rPr>
+        <w:t>Terraform</w:t>
+      </w:r>
+      <w:proofErr w:type="spellEnd"/>
+      <w:r>
+        <w:rPr>
+          <w:rFonts w:ascii="Segoe UI" w:hAnsi="Segoe UI" w:cs="Segoe UI"/>
+          <w:color w:val="7B88A1"/>
+          <w:sz w:val="20"/>
+          <w:szCs w:val="20"/>
+        </w:rPr>
+        <w:t xml:space="preserve"> é exatamente o </w:t>
+      </w:r>
+      <w:proofErr w:type="spellStart"/>
+      <w:r>
+        <w:rPr>
+          <w:rFonts w:ascii="Segoe UI" w:hAnsi="Segoe UI" w:cs="Segoe UI"/>
+          <w:color w:val="7B88A1"/>
+          <w:sz w:val="20"/>
+          <w:szCs w:val="20"/>
+        </w:rPr>
+        <w:t>repo</w:t>
+      </w:r>
+      <w:proofErr w:type="spellEnd"/>
+      <w:r>
+        <w:rPr>
+          <w:rFonts w:ascii="Segoe UI" w:hAnsi="Segoe UI" w:cs="Segoe UI"/>
+          <w:color w:val="7B88A1"/>
+          <w:sz w:val="20"/>
+          <w:szCs w:val="20"/>
+        </w:rPr>
+        <w:t xml:space="preserve"> onde você cadastrou os </w:t>
+      </w:r>
+      <w:proofErr w:type="spellStart"/>
+      <w:r>
+        <w:rPr>
+          <w:rFonts w:ascii="Segoe UI" w:hAnsi="Segoe UI" w:cs="Segoe UI"/>
+          <w:color w:val="7B88A1"/>
+          <w:sz w:val="20"/>
+          <w:szCs w:val="20"/>
+        </w:rPr>
+        <w:t>secrets</w:t>
+      </w:r>
+      <w:proofErr w:type="spellEnd"/>
+      <w:r>
+        <w:rPr>
+          <w:rFonts w:ascii="Segoe UI" w:hAnsi="Segoe UI" w:cs="Segoe UI"/>
+          <w:color w:val="7B88A1"/>
+          <w:sz w:val="20"/>
+          <w:szCs w:val="20"/>
+        </w:rPr>
+        <w:t xml:space="preserve"> (</w:t>
+      </w:r>
+      <w:proofErr w:type="spellStart"/>
+      <w:r>
+        <w:rPr>
+          <w:rFonts w:ascii="Segoe UI" w:hAnsi="Segoe UI" w:cs="Segoe UI"/>
+          <w:color w:val="7B88A1"/>
+          <w:sz w:val="20"/>
+          <w:szCs w:val="20"/>
+        </w:rPr>
+        <w:t>owner</w:t>
+      </w:r>
+      <w:proofErr w:type="spellEnd"/>
+      <w:r>
+        <w:rPr>
+          <w:rFonts w:ascii="Segoe UI" w:hAnsi="Segoe UI" w:cs="Segoe UI"/>
+          <w:color w:val="7B88A1"/>
+          <w:sz w:val="20"/>
+          <w:szCs w:val="20"/>
+        </w:rPr>
+        <w:t>/nome do repositório no GitHub).</w:t>
+      </w:r>
+    </w:p>
+    <w:p>
+      <w:pPr>
+        <w:rPr>
+          <w:rFonts w:cstheme="minorHAnsi"/>
+        </w:rPr>
+      </w:pPr>
+    </w:p>
+    <w:p>
+      <w:pPr>
+        <w:shd w:val="clear" w:color="auto" w:fill="1E2127"/>
+        <w:spacing w:after="90" w:line="240" w:lineRule="auto"/>
+        <w:rPr>
+          <w:rFonts w:ascii="Segoe UI" w:eastAsia="Times New Roman" w:hAnsi="Segoe UI" w:cs="Segoe UI"/>
+          <w:color w:val="7B88A1"/>
+          <w:sz w:val="20"/>
+          <w:szCs w:val="20"/>
+          <w:lang w:eastAsia="pt-BR"/>
+        </w:rPr>
+      </w:pPr>
+      <w:r>
+        <w:rPr>
+          <w:rFonts w:ascii="Segoe UI" w:eastAsia="Times New Roman" w:hAnsi="Segoe UI" w:cs="Segoe UI"/>
+          <w:color w:val="7B88A1"/>
+          <w:sz w:val="20"/>
+          <w:szCs w:val="20"/>
+          <w:lang w:eastAsia="pt-BR"/>
+        </w:rPr>
+        <w:t>Lista para </w:t>
+      </w:r>
+      <w:r>
+        <w:rPr>
+          <w:rFonts w:ascii="Segoe UI" w:eastAsia="Times New Roman" w:hAnsi="Segoe UI" w:cs="Segoe UI"/>
+          <w:b/>
+          <w:bCs/>
+          <w:color w:val="7B88A1"/>
+          <w:sz w:val="24"/>
+          <w:szCs w:val="24"/>
+          <w:lang w:eastAsia="pt-BR"/>
+        </w:rPr>
+        <w:t xml:space="preserve">Settings → </w:t>
+      </w:r>
+      <w:proofErr w:type="spellStart"/>
+      <w:r>
+        <w:rPr>
+          <w:rFonts w:ascii="Segoe UI" w:eastAsia="Times New Roman" w:hAnsi="Segoe UI" w:cs="Segoe UI"/>
+          <w:b/>
+          <w:bCs/>
+          <w:color w:val="7B88A1"/>
+          <w:sz w:val="24"/>
+          <w:szCs w:val="24"/>
+          <w:lang w:eastAsia="pt-BR"/>
+        </w:rPr>
+        <w:t>Secrets</w:t>
+      </w:r>
+      <w:proofErr w:type="spellEnd"/>
+      <w:r>
+        <w:rPr>
+          <w:rFonts w:ascii="Segoe UI" w:eastAsia="Times New Roman" w:hAnsi="Segoe UI" w:cs="Segoe UI"/>
+          <w:b/>
+          <w:bCs/>
+          <w:color w:val="7B88A1"/>
+          <w:sz w:val="24"/>
+          <w:szCs w:val="24"/>
+          <w:lang w:eastAsia="pt-BR"/>
+        </w:rPr>
+        <w:t xml:space="preserve"> </w:t>
+      </w:r>
+      <w:proofErr w:type="spellStart"/>
+      <w:r>
+        <w:rPr>
+          <w:rFonts w:ascii="Segoe UI" w:eastAsia="Times New Roman" w:hAnsi="Segoe UI" w:cs="Segoe UI"/>
+          <w:b/>
+          <w:bCs/>
+          <w:color w:val="7B88A1"/>
+          <w:sz w:val="24"/>
+          <w:szCs w:val="24"/>
+          <w:lang w:eastAsia="pt-BR"/>
+        </w:rPr>
+        <w:t>and</w:t>
+      </w:r>
+      <w:proofErr w:type="spellEnd"/>
+      <w:r>
+        <w:rPr>
+          <w:rFonts w:ascii="Segoe UI" w:eastAsia="Times New Roman" w:hAnsi="Segoe UI" w:cs="Segoe UI"/>
+          <w:b/>
+          <w:bCs/>
+          <w:color w:val="7B88A1"/>
+          <w:sz w:val="24"/>
+          <w:szCs w:val="24"/>
+          <w:lang w:eastAsia="pt-BR"/>
+        </w:rPr>
+        <w:t xml:space="preserve"> </w:t>
+      </w:r>
+      <w:proofErr w:type="spellStart"/>
+      <w:r>
+        <w:rPr>
+          <w:rFonts w:ascii="Segoe UI" w:eastAsia="Times New Roman" w:hAnsi="Segoe UI" w:cs="Segoe UI"/>
+          <w:b/>
+          <w:bCs/>
+          <w:color w:val="7B88A1"/>
+          <w:sz w:val="24"/>
+          <w:szCs w:val="24"/>
+          <w:lang w:eastAsia="pt-BR"/>
+        </w:rPr>
+        <w:t>variables</w:t>
+      </w:r>
+      <w:proofErr w:type="spellEnd"/>
+      <w:r>
+        <w:rPr>
+          <w:rFonts w:ascii="Segoe UI" w:eastAsia="Times New Roman" w:hAnsi="Segoe UI" w:cs="Segoe UI"/>
+          <w:b/>
+          <w:bCs/>
+          <w:color w:val="7B88A1"/>
+          <w:sz w:val="24"/>
+          <w:szCs w:val="24"/>
+          <w:lang w:eastAsia="pt-BR"/>
+        </w:rPr>
+        <w:t xml:space="preserve"> → </w:t>
+      </w:r>
+      <w:proofErr w:type="spellStart"/>
+      <w:r>
+        <w:rPr>
+          <w:rFonts w:ascii="Segoe UI" w:eastAsia="Times New Roman" w:hAnsi="Segoe UI" w:cs="Segoe UI"/>
+          <w:b/>
+          <w:bCs/>
+          <w:color w:val="7B88A1"/>
+          <w:sz w:val="24"/>
+          <w:szCs w:val="24"/>
+          <w:lang w:eastAsia="pt-BR"/>
+        </w:rPr>
+        <w:t>Actions</w:t>
+      </w:r>
+      <w:proofErr w:type="spellEnd"/>
+      <w:r>
+        <w:rPr>
+          <w:rFonts w:ascii="Segoe UI" w:eastAsia="Times New Roman" w:hAnsi="Segoe UI" w:cs="Segoe UI"/>
+          <w:b/>
+          <w:bCs/>
+          <w:color w:val="7B88A1"/>
+          <w:sz w:val="24"/>
+          <w:szCs w:val="24"/>
+          <w:lang w:eastAsia="pt-BR"/>
+        </w:rPr>
+        <w:t xml:space="preserve"> → </w:t>
+      </w:r>
+      <w:proofErr w:type="spellStart"/>
+      <w:r>
+        <w:rPr>
+          <w:rFonts w:ascii="Segoe UI" w:eastAsia="Times New Roman" w:hAnsi="Segoe UI" w:cs="Segoe UI"/>
+          <w:b/>
+          <w:bCs/>
+          <w:color w:val="7B88A1"/>
+          <w:sz w:val="24"/>
+          <w:szCs w:val="24"/>
+          <w:lang w:eastAsia="pt-BR"/>
+        </w:rPr>
+        <w:t>Repository</w:t>
+      </w:r>
+      <w:proofErr w:type="spellEnd"/>
+      <w:r>
+        <w:rPr>
+          <w:rFonts w:ascii="Segoe UI" w:eastAsia="Times New Roman" w:hAnsi="Segoe UI" w:cs="Segoe UI"/>
+          <w:b/>
+          <w:bCs/>
+          <w:color w:val="7B88A1"/>
+          <w:sz w:val="24"/>
+          <w:szCs w:val="24"/>
+          <w:lang w:eastAsia="pt-BR"/>
+        </w:rPr>
+        <w:t xml:space="preserve"> </w:t>
+      </w:r>
+      <w:proofErr w:type="spellStart"/>
+      <w:r>
+        <w:rPr>
+          <w:rFonts w:ascii="Segoe UI" w:eastAsia="Times New Roman" w:hAnsi="Segoe UI" w:cs="Segoe UI"/>
+          <w:b/>
+          <w:bCs/>
+          <w:color w:val="7B88A1"/>
+          <w:sz w:val="24"/>
+          <w:szCs w:val="24"/>
+          <w:lang w:eastAsia="pt-BR"/>
+        </w:rPr>
+        <w:t>secrets</w:t>
+      </w:r>
+      <w:proofErr w:type="spellEnd"/>
+      <w:r>
+        <w:rPr>
+          <w:rFonts w:ascii="Segoe UI" w:eastAsia="Times New Roman" w:hAnsi="Segoe UI" w:cs="Segoe UI"/>
+          <w:color w:val="7B88A1"/>
+          <w:sz w:val="20"/>
+          <w:szCs w:val="20"/>
+          <w:lang w:eastAsia="pt-BR"/>
+        </w:rPr>
+        <w:t>, com os valores atuais do seu </w:t>
+      </w:r>
+      <w:proofErr w:type="spellStart"/>
+      <w:r>
+        <w:rPr>
+          <w:rFonts w:ascii="Consolas" w:eastAsia="Times New Roman" w:hAnsi="Consolas" w:cs="Courier New"/>
+          <w:color w:val="7B88A1"/>
+          <w:sz w:val="18"/>
+          <w:szCs w:val="18"/>
+          <w:lang w:eastAsia="pt-BR"/>
+        </w:rPr>
+        <w:t>terraform</w:t>
+      </w:r>
+      <w:proofErr w:type="spellEnd"/>
+      <w:r>
+        <w:rPr>
+          <w:rFonts w:ascii="Consolas" w:eastAsia="Times New Roman" w:hAnsi="Consolas" w:cs="Courier New"/>
+          <w:color w:val="7B88A1"/>
+          <w:sz w:val="18"/>
+          <w:szCs w:val="18"/>
+          <w:lang w:eastAsia="pt-BR"/>
+        </w:rPr>
+        <w:t xml:space="preserve"> </w:t>
+      </w:r>
+      <w:proofErr w:type="spellStart"/>
+      <w:r>
+        <w:rPr>
+          <w:rFonts w:ascii="Consolas" w:eastAsia="Times New Roman" w:hAnsi="Consolas" w:cs="Courier New"/>
+          <w:color w:val="7B88A1"/>
+          <w:sz w:val="18"/>
+          <w:szCs w:val="18"/>
+          <w:lang w:eastAsia="pt-BR"/>
+        </w:rPr>
+        <w:t>apply</w:t>
+      </w:r>
+      <w:proofErr w:type="spellEnd"/>
+      <w:r>
+        <w:rPr>
+          <w:rFonts w:ascii="Segoe UI" w:eastAsia="Times New Roman" w:hAnsi="Segoe UI" w:cs="Segoe UI"/>
+          <w:color w:val="7B88A1"/>
+          <w:sz w:val="20"/>
+          <w:szCs w:val="20"/>
+          <w:lang w:eastAsia="pt-BR"/>
+        </w:rPr>
+        <w:t>:</w:t>
+      </w:r>
+    </w:p>
+    <w:p>
+      <w:r>
+        <w:br w:type="page"/>
+      </w:r>
+    </w:p>
+    <w:tbl>
+      <w:tblPr>
+        <w:tblW w:w="0" w:type="auto"/>
+        <w:tblCellMar>
+          <w:top w:w="15" w:type="dxa"/>
+          <w:left w:w="15" w:type="dxa"/>
+          <w:bottom w:w="15" w:type="dxa"/>
+          <w:right w:w="15" w:type="dxa"/>
+        </w:tblCellMar>
+        <w:tblLook w:val="04A0" w:firstRow="1" w:lastRow="0" w:firstColumn="1" w:lastColumn="0" w:noHBand="0" w:noVBand="1"/>
+      </w:tblPr>
+      <w:tblGrid>
+        <w:gridCol w:w="3415"/>
+        <w:gridCol w:w="5089"/>
+      </w:tblGrid>
+      <w:tr>
+        <w:trPr>
+          <w:tblHeader/>
+        </w:trPr>
+        <w:tc>
+          <w:tcPr>
+            <w:tcW w:w="0" w:type="auto"/>
+            <w:noWrap/>
+            <w:tcMar>
+              <w:top w:w="75" w:type="dxa"/>
+              <w:left w:w="135" w:type="dxa"/>
+              <w:bottom w:w="75" w:type="dxa"/>
+              <w:right w:w="135" w:type="dxa"/>
+            </w:tcMar>
+            <w:hideMark/>
+          </w:tcPr>
+          <w:p>
+            <w:pPr>
+              <w:spacing w:after="0" w:line="240" w:lineRule="auto"/>
+              <w:rPr>
+                <w:rFonts w:ascii="Times New Roman" w:eastAsia="Times New Roman" w:hAnsi="Times New Roman" w:cs="Times New Roman"/>
+                <w:b/>
+                <w:bCs/>
+                <w:sz w:val="21"/>
+                <w:szCs w:val="21"/>
+                <w:lang w:eastAsia="pt-BR"/>
+              </w:rPr>
+            </w:pPr>
+            <w:proofErr w:type="spellStart"/>
+            <w:r>
+              <w:rPr>
+                <w:rFonts w:ascii="Times New Roman" w:eastAsia="Times New Roman" w:hAnsi="Times New Roman" w:cs="Times New Roman"/>
+                <w:b/>
+                <w:bCs/>
+                <w:sz w:val="21"/>
+                <w:szCs w:val="21"/>
+                <w:lang w:eastAsia="pt-BR"/>
+              </w:rPr>
+              <w:lastRenderedPageBreak/>
+              <w:t>Secret</w:t>
+            </w:r>
+            <w:proofErr w:type="spellEnd"/>
+            <w:r>
+              <w:rPr>
+                <w:rFonts w:ascii="Times New Roman" w:eastAsia="Times New Roman" w:hAnsi="Times New Roman" w:cs="Times New Roman"/>
+                <w:b/>
+                <w:bCs/>
+                <w:sz w:val="21"/>
+                <w:szCs w:val="21"/>
+                <w:lang w:eastAsia="pt-BR"/>
+              </w:rPr>
+              <w:t xml:space="preserve"> (nome exato)</w:t>
+            </w:r>
+          </w:p>
+        </w:tc>
+        <w:tc>
+          <w:tcPr>
+            <w:tcW w:w="0" w:type="auto"/>
+            <w:tcBorders>
+              <w:right w:val="nil"/>
+            </w:tcBorders>
+            <w:noWrap/>
+            <w:tcMar>
+              <w:top w:w="75" w:type="dxa"/>
+              <w:left w:w="135" w:type="dxa"/>
+              <w:bottom w:w="75" w:type="dxa"/>
+              <w:right w:w="135" w:type="dxa"/>
+            </w:tcMar>
+            <w:hideMark/>
+          </w:tcPr>
+          <w:p>
+            <w:pPr>
+              <w:spacing w:after="0" w:line="240" w:lineRule="auto"/>
+              <w:rPr>
+                <w:rFonts w:ascii="Times New Roman" w:eastAsia="Times New Roman" w:hAnsi="Times New Roman" w:cs="Times New Roman"/>
+                <w:b/>
+                <w:bCs/>
+                <w:sz w:val="21"/>
+                <w:szCs w:val="21"/>
+                <w:lang w:eastAsia="pt-BR"/>
+              </w:rPr>
+            </w:pPr>
+            <w:r>
+              <w:rPr>
+                <w:rFonts w:ascii="Times New Roman" w:eastAsia="Times New Roman" w:hAnsi="Times New Roman" w:cs="Times New Roman"/>
+                <w:b/>
+                <w:bCs/>
+                <w:sz w:val="21"/>
+                <w:szCs w:val="21"/>
+                <w:lang w:eastAsia="pt-BR"/>
+              </w:rPr>
+              <w:t>Valor a cadastrar</w:t>
+            </w:r>
+          </w:p>
+        </w:tc>
+      </w:tr>
+      <w:tr>
+        <w:tc>
+          <w:tcPr>
+            <w:tcW w:w="0" w:type="auto"/>
+            <w:tcMar>
+              <w:top w:w="75" w:type="dxa"/>
+              <w:left w:w="135" w:type="dxa"/>
+              <w:bottom w:w="75" w:type="dxa"/>
+              <w:right w:w="135" w:type="dxa"/>
+            </w:tcMar>
+            <w:hideMark/>
+          </w:tcPr>
+          <w:p>
+            <w:pPr>
+              <w:spacing w:after="0" w:line="240" w:lineRule="auto"/>
+              <w:rPr>
+                <w:rFonts w:ascii="Times New Roman" w:eastAsia="Times New Roman" w:hAnsi="Times New Roman" w:cs="Times New Roman"/>
+                <w:sz w:val="24"/>
+                <w:szCs w:val="24"/>
+                <w:lang w:eastAsia="pt-BR"/>
+              </w:rPr>
+            </w:pPr>
+            <w:r>
+              <w:rPr>
+                <w:rFonts w:ascii="Consolas" w:eastAsia="Times New Roman" w:hAnsi="Consolas" w:cs="Courier New"/>
+                <w:lang w:eastAsia="pt-BR"/>
+              </w:rPr>
+              <w:t>AWS_ROLE_ARN</w:t>
+            </w:r>
+          </w:p>
+        </w:tc>
+        <w:tc>
+          <w:tcPr>
+            <w:tcW w:w="0" w:type="auto"/>
+            <w:tcBorders>
+              <w:right w:val="nil"/>
+            </w:tcBorders>
+            <w:tcMar>
+              <w:top w:w="75" w:type="dxa"/>
+              <w:left w:w="135" w:type="dxa"/>
+              <w:bottom w:w="75" w:type="dxa"/>
+              <w:right w:w="135" w:type="dxa"/>
+            </w:tcMar>
+            <w:hideMark/>
+          </w:tcPr>
+          <w:p>
+            <w:pPr>
+              <w:spacing w:after="0" w:line="240" w:lineRule="auto"/>
+              <w:rPr>
+                <w:rFonts w:ascii="Times New Roman" w:eastAsia="Times New Roman" w:hAnsi="Times New Roman" w:cs="Times New Roman"/>
+                <w:sz w:val="24"/>
+                <w:szCs w:val="24"/>
+                <w:lang w:eastAsia="pt-BR"/>
+              </w:rPr>
+            </w:pPr>
+            <w:proofErr w:type="spellStart"/>
+            <w:r>
+              <w:rPr>
+                <w:rFonts w:ascii="Consolas" w:eastAsia="Times New Roman" w:hAnsi="Consolas" w:cs="Courier New"/>
+                <w:lang w:eastAsia="pt-BR"/>
+              </w:rPr>
+              <w:t>arn:aws:</w:t>
+            </w:r>
+            <w:proofErr w:type="gramStart"/>
+            <w:r>
+              <w:rPr>
+                <w:rFonts w:ascii="Consolas" w:eastAsia="Times New Roman" w:hAnsi="Consolas" w:cs="Courier New"/>
+                <w:lang w:eastAsia="pt-BR"/>
+              </w:rPr>
+              <w:t>iam</w:t>
+            </w:r>
+            <w:proofErr w:type="spellEnd"/>
+            <w:r>
+              <w:rPr>
+                <w:rFonts w:ascii="Consolas" w:eastAsia="Times New Roman" w:hAnsi="Consolas" w:cs="Courier New"/>
+                <w:lang w:eastAsia="pt-BR"/>
+              </w:rPr>
+              <w:t>::</w:t>
+            </w:r>
+            <w:proofErr w:type="gramEnd"/>
+            <w:r>
+              <w:rPr>
+                <w:rFonts w:ascii="Consolas" w:eastAsia="Times New Roman" w:hAnsi="Consolas" w:cs="Courier New"/>
+                <w:lang w:eastAsia="pt-BR"/>
+              </w:rPr>
+              <w:t>813632940660:role/</w:t>
+            </w:r>
+            <w:proofErr w:type="spellStart"/>
+            <w:r>
+              <w:rPr>
+                <w:rFonts w:ascii="Consolas" w:eastAsia="Times New Roman" w:hAnsi="Consolas" w:cs="Courier New"/>
+                <w:lang w:eastAsia="pt-BR"/>
+              </w:rPr>
+              <w:t>yolo-violence-prod-github-actions</w:t>
+            </w:r>
+            <w:proofErr w:type="spellEnd"/>
+          </w:p>
+        </w:tc>
+      </w:tr>
+      <w:tr>
+        <w:tc>
+          <w:tcPr>
+            <w:tcW w:w="0" w:type="auto"/>
+            <w:tcMar>
+              <w:top w:w="75" w:type="dxa"/>
+              <w:left w:w="135" w:type="dxa"/>
+              <w:bottom w:w="75" w:type="dxa"/>
+              <w:right w:w="135" w:type="dxa"/>
+            </w:tcMar>
+            <w:hideMark/>
+          </w:tcPr>
+          <w:p>
+            <w:pPr>
+              <w:spacing w:after="0" w:line="240" w:lineRule="auto"/>
+              <w:rPr>
+                <w:rFonts w:ascii="Times New Roman" w:eastAsia="Times New Roman" w:hAnsi="Times New Roman" w:cs="Times New Roman"/>
+                <w:sz w:val="24"/>
+                <w:szCs w:val="24"/>
+                <w:lang w:eastAsia="pt-BR"/>
+              </w:rPr>
+            </w:pPr>
+            <w:r>
+              <w:rPr>
+                <w:rFonts w:ascii="Consolas" w:eastAsia="Times New Roman" w:hAnsi="Consolas" w:cs="Courier New"/>
+                <w:lang w:eastAsia="pt-BR"/>
+              </w:rPr>
+              <w:t>ECR_REPOSITORY_NAME</w:t>
+            </w:r>
+          </w:p>
+        </w:tc>
+        <w:tc>
+          <w:tcPr>
+            <w:tcW w:w="0" w:type="auto"/>
+            <w:tcBorders>
+              <w:right w:val="nil"/>
+            </w:tcBorders>
+            <w:tcMar>
+              <w:top w:w="75" w:type="dxa"/>
+              <w:left w:w="135" w:type="dxa"/>
+              <w:bottom w:w="75" w:type="dxa"/>
+              <w:right w:w="135" w:type="dxa"/>
+            </w:tcMar>
+            <w:hideMark/>
+          </w:tcPr>
+          <w:p>
+            <w:pPr>
+              <w:spacing w:after="0" w:line="240" w:lineRule="auto"/>
+              <w:rPr>
+                <w:rFonts w:ascii="Times New Roman" w:eastAsia="Times New Roman" w:hAnsi="Times New Roman" w:cs="Times New Roman"/>
+                <w:sz w:val="24"/>
+                <w:szCs w:val="24"/>
+                <w:lang w:eastAsia="pt-BR"/>
+              </w:rPr>
+            </w:pPr>
+            <w:proofErr w:type="spellStart"/>
+            <w:r>
+              <w:rPr>
+                <w:rFonts w:ascii="Consolas" w:eastAsia="Times New Roman" w:hAnsi="Consolas" w:cs="Courier New"/>
+                <w:lang w:eastAsia="pt-BR"/>
+              </w:rPr>
+              <w:t>yolo</w:t>
+            </w:r>
+            <w:proofErr w:type="spellEnd"/>
+            <w:r>
+              <w:rPr>
+                <w:rFonts w:ascii="Consolas" w:eastAsia="Times New Roman" w:hAnsi="Consolas" w:cs="Courier New"/>
+                <w:lang w:eastAsia="pt-BR"/>
+              </w:rPr>
+              <w:t>-</w:t>
+            </w:r>
+            <w:proofErr w:type="spellStart"/>
+            <w:r>
+              <w:rPr>
+                <w:rFonts w:ascii="Consolas" w:eastAsia="Times New Roman" w:hAnsi="Consolas" w:cs="Courier New"/>
+                <w:lang w:eastAsia="pt-BR"/>
+              </w:rPr>
+              <w:t>violence</w:t>
+            </w:r>
+            <w:proofErr w:type="spellEnd"/>
+            <w:r>
+              <w:rPr>
+                <w:rFonts w:ascii="Consolas" w:eastAsia="Times New Roman" w:hAnsi="Consolas" w:cs="Courier New"/>
+                <w:lang w:eastAsia="pt-BR"/>
+              </w:rPr>
+              <w:t>-</w:t>
+            </w:r>
+            <w:proofErr w:type="spellStart"/>
+            <w:r>
+              <w:rPr>
+                <w:rFonts w:ascii="Consolas" w:eastAsia="Times New Roman" w:hAnsi="Consolas" w:cs="Courier New"/>
+                <w:lang w:eastAsia="pt-BR"/>
+              </w:rPr>
+              <w:t>prod</w:t>
+            </w:r>
+            <w:proofErr w:type="spellEnd"/>
+            <w:r>
+              <w:rPr>
+                <w:rFonts w:ascii="Consolas" w:eastAsia="Times New Roman" w:hAnsi="Consolas" w:cs="Courier New"/>
+                <w:lang w:eastAsia="pt-BR"/>
+              </w:rPr>
+              <w:t>-app</w:t>
+            </w:r>
+          </w:p>
+        </w:tc>
+      </w:tr>
+      <w:tr>
+        <w:tc>
+          <w:tcPr>
+            <w:tcW w:w="0" w:type="auto"/>
+            <w:tcMar>
+              <w:top w:w="75" w:type="dxa"/>
+              <w:left w:w="135" w:type="dxa"/>
+              <w:bottom w:w="75" w:type="dxa"/>
+              <w:right w:w="135" w:type="dxa"/>
+            </w:tcMar>
+            <w:hideMark/>
+          </w:tcPr>
+          <w:p>
+            <w:pPr>
+              <w:spacing w:after="0" w:line="240" w:lineRule="auto"/>
+              <w:rPr>
+                <w:rFonts w:ascii="Times New Roman" w:eastAsia="Times New Roman" w:hAnsi="Times New Roman" w:cs="Times New Roman"/>
+                <w:sz w:val="24"/>
+                <w:szCs w:val="24"/>
+                <w:lang w:eastAsia="pt-BR"/>
+              </w:rPr>
+            </w:pPr>
+            <w:r>
+              <w:rPr>
+                <w:rFonts w:ascii="Consolas" w:eastAsia="Times New Roman" w:hAnsi="Consolas" w:cs="Courier New"/>
+                <w:lang w:eastAsia="pt-BR"/>
+              </w:rPr>
+              <w:t>ECS_CLUSTER_NAME</w:t>
+            </w:r>
+          </w:p>
+        </w:tc>
+        <w:tc>
+          <w:tcPr>
+            <w:tcW w:w="0" w:type="auto"/>
+            <w:tcBorders>
+              <w:right w:val="nil"/>
+            </w:tcBorders>
+            <w:tcMar>
+              <w:top w:w="75" w:type="dxa"/>
+              <w:left w:w="135" w:type="dxa"/>
+              <w:bottom w:w="75" w:type="dxa"/>
+              <w:right w:w="135" w:type="dxa"/>
+            </w:tcMar>
+            <w:hideMark/>
+          </w:tcPr>
+          <w:p>
+            <w:pPr>
+              <w:spacing w:after="0" w:line="240" w:lineRule="auto"/>
+              <w:rPr>
+                <w:rFonts w:ascii="Times New Roman" w:eastAsia="Times New Roman" w:hAnsi="Times New Roman" w:cs="Times New Roman"/>
+                <w:sz w:val="24"/>
+                <w:szCs w:val="24"/>
+                <w:lang w:eastAsia="pt-BR"/>
+              </w:rPr>
+            </w:pPr>
+            <w:proofErr w:type="spellStart"/>
+            <w:r>
+              <w:rPr>
+                <w:rFonts w:ascii="Consolas" w:eastAsia="Times New Roman" w:hAnsi="Consolas" w:cs="Courier New"/>
+                <w:lang w:eastAsia="pt-BR"/>
+              </w:rPr>
+              <w:t>yolo</w:t>
+            </w:r>
+            <w:proofErr w:type="spellEnd"/>
+            <w:r>
+              <w:rPr>
+                <w:rFonts w:ascii="Consolas" w:eastAsia="Times New Roman" w:hAnsi="Consolas" w:cs="Courier New"/>
+                <w:lang w:eastAsia="pt-BR"/>
+              </w:rPr>
+              <w:t>-</w:t>
+            </w:r>
+            <w:proofErr w:type="spellStart"/>
+            <w:r>
+              <w:rPr>
+                <w:rFonts w:ascii="Consolas" w:eastAsia="Times New Roman" w:hAnsi="Consolas" w:cs="Courier New"/>
+                <w:lang w:eastAsia="pt-BR"/>
+              </w:rPr>
+              <w:t>violence</w:t>
+            </w:r>
+            <w:proofErr w:type="spellEnd"/>
+            <w:r>
+              <w:rPr>
+                <w:rFonts w:ascii="Consolas" w:eastAsia="Times New Roman" w:hAnsi="Consolas" w:cs="Courier New"/>
+                <w:lang w:eastAsia="pt-BR"/>
+              </w:rPr>
+              <w:t>-</w:t>
+            </w:r>
+            <w:proofErr w:type="spellStart"/>
+            <w:r>
+              <w:rPr>
+                <w:rFonts w:ascii="Consolas" w:eastAsia="Times New Roman" w:hAnsi="Consolas" w:cs="Courier New"/>
+                <w:lang w:eastAsia="pt-BR"/>
+              </w:rPr>
+              <w:t>prod</w:t>
+            </w:r>
+            <w:proofErr w:type="spellEnd"/>
+            <w:r>
+              <w:rPr>
+                <w:rFonts w:ascii="Consolas" w:eastAsia="Times New Roman" w:hAnsi="Consolas" w:cs="Courier New"/>
+                <w:lang w:eastAsia="pt-BR"/>
+              </w:rPr>
+              <w:t>-cluster</w:t>
+            </w:r>
+          </w:p>
+        </w:tc>
+      </w:tr>
+      <w:tr>
+        <w:tc>
+          <w:tcPr>
+            <w:tcW w:w="0" w:type="auto"/>
+            <w:tcMar>
+              <w:top w:w="75" w:type="dxa"/>
+              <w:left w:w="135" w:type="dxa"/>
+              <w:bottom w:w="75" w:type="dxa"/>
+              <w:right w:w="135" w:type="dxa"/>
+            </w:tcMar>
+            <w:hideMark/>
+          </w:tcPr>
+          <w:p>
+            <w:pPr>
+              <w:spacing w:after="0" w:line="240" w:lineRule="auto"/>
+              <w:rPr>
+                <w:rFonts w:ascii="Times New Roman" w:eastAsia="Times New Roman" w:hAnsi="Times New Roman" w:cs="Times New Roman"/>
+                <w:sz w:val="24"/>
+                <w:szCs w:val="24"/>
+                <w:lang w:eastAsia="pt-BR"/>
+              </w:rPr>
+            </w:pPr>
+            <w:r>
+              <w:rPr>
+                <w:rFonts w:ascii="Consolas" w:eastAsia="Times New Roman" w:hAnsi="Consolas" w:cs="Courier New"/>
+                <w:lang w:eastAsia="pt-BR"/>
+              </w:rPr>
+              <w:t>ECS_TASK_DEFINITION_FAMILY</w:t>
+            </w:r>
+          </w:p>
+        </w:tc>
+        <w:tc>
+          <w:tcPr>
+            <w:tcW w:w="0" w:type="auto"/>
+            <w:tcBorders>
+              <w:right w:val="nil"/>
+            </w:tcBorders>
+            <w:tcMar>
+              <w:top w:w="75" w:type="dxa"/>
+              <w:left w:w="135" w:type="dxa"/>
+              <w:bottom w:w="75" w:type="dxa"/>
+              <w:right w:w="135" w:type="dxa"/>
+            </w:tcMar>
+            <w:hideMark/>
+          </w:tcPr>
+          <w:p>
+            <w:pPr>
+              <w:spacing w:after="0" w:line="240" w:lineRule="auto"/>
+              <w:rPr>
+                <w:rFonts w:ascii="Times New Roman" w:eastAsia="Times New Roman" w:hAnsi="Times New Roman" w:cs="Times New Roman"/>
+                <w:sz w:val="24"/>
+                <w:szCs w:val="24"/>
+                <w:lang w:eastAsia="pt-BR"/>
+              </w:rPr>
+            </w:pPr>
+            <w:proofErr w:type="spellStart"/>
+            <w:r>
+              <w:rPr>
+                <w:rFonts w:ascii="Consolas" w:eastAsia="Times New Roman" w:hAnsi="Consolas" w:cs="Courier New"/>
+                <w:lang w:eastAsia="pt-BR"/>
+              </w:rPr>
+              <w:t>yolo-violence-prod-task</w:t>
+            </w:r>
+            <w:proofErr w:type="spellEnd"/>
+          </w:p>
+        </w:tc>
+      </w:tr>
+      <w:tr>
+        <w:tc>
+          <w:tcPr>
+            <w:tcW w:w="0" w:type="auto"/>
+            <w:tcMar>
+              <w:top w:w="75" w:type="dxa"/>
+              <w:left w:w="135" w:type="dxa"/>
+              <w:bottom w:w="75" w:type="dxa"/>
+              <w:right w:w="135" w:type="dxa"/>
+            </w:tcMar>
+            <w:hideMark/>
+          </w:tcPr>
+          <w:p>
+            <w:pPr>
+              <w:spacing w:after="0" w:line="240" w:lineRule="auto"/>
+              <w:rPr>
+                <w:rFonts w:ascii="Times New Roman" w:eastAsia="Times New Roman" w:hAnsi="Times New Roman" w:cs="Times New Roman"/>
+                <w:sz w:val="24"/>
+                <w:szCs w:val="24"/>
+                <w:lang w:eastAsia="pt-BR"/>
+              </w:rPr>
+            </w:pPr>
+            <w:r>
+              <w:rPr>
+                <w:rFonts w:ascii="Consolas" w:eastAsia="Times New Roman" w:hAnsi="Consolas" w:cs="Courier New"/>
+                <w:lang w:eastAsia="pt-BR"/>
+              </w:rPr>
+              <w:t>ECS_CONTAINER_NAME</w:t>
+            </w:r>
+          </w:p>
+        </w:tc>
+        <w:tc>
+          <w:tcPr>
+            <w:tcW w:w="0" w:type="auto"/>
+            <w:tcBorders>
+              <w:right w:val="nil"/>
+            </w:tcBorders>
+            <w:tcMar>
+              <w:top w:w="75" w:type="dxa"/>
+              <w:left w:w="135" w:type="dxa"/>
+              <w:bottom w:w="75" w:type="dxa"/>
+              <w:right w:w="135" w:type="dxa"/>
+            </w:tcMar>
+            <w:hideMark/>
+          </w:tcPr>
+          <w:p>
+            <w:pPr>
+              <w:spacing w:after="0" w:line="240" w:lineRule="auto"/>
+              <w:rPr>
+                <w:rFonts w:ascii="Times New Roman" w:eastAsia="Times New Roman" w:hAnsi="Times New Roman" w:cs="Times New Roman"/>
+                <w:sz w:val="24"/>
+                <w:szCs w:val="24"/>
+                <w:lang w:eastAsia="pt-BR"/>
+              </w:rPr>
+            </w:pPr>
+            <w:proofErr w:type="spellStart"/>
+            <w:r>
+              <w:rPr>
+                <w:rFonts w:ascii="Consolas" w:eastAsia="Times New Roman" w:hAnsi="Consolas" w:cs="Courier New"/>
+                <w:lang w:eastAsia="pt-BR"/>
+              </w:rPr>
+              <w:t>yolo-violence</w:t>
+            </w:r>
+            <w:proofErr w:type="spellEnd"/>
+          </w:p>
+        </w:tc>
+      </w:tr>
+      <w:tr>
+        <w:tc>
+          <w:tcPr>
+            <w:tcW w:w="0" w:type="auto"/>
+            <w:tcMar>
+              <w:top w:w="75" w:type="dxa"/>
+              <w:left w:w="135" w:type="dxa"/>
+              <w:bottom w:w="75" w:type="dxa"/>
+              <w:right w:w="135" w:type="dxa"/>
+            </w:tcMar>
+            <w:hideMark/>
+          </w:tcPr>
+          <w:p>
+            <w:pPr>
+              <w:spacing w:after="0" w:line="240" w:lineRule="auto"/>
+              <w:rPr>
+                <w:rFonts w:ascii="Times New Roman" w:eastAsia="Times New Roman" w:hAnsi="Times New Roman" w:cs="Times New Roman"/>
+                <w:sz w:val="24"/>
+                <w:szCs w:val="24"/>
+                <w:lang w:eastAsia="pt-BR"/>
+              </w:rPr>
+            </w:pPr>
+            <w:r>
+              <w:rPr>
+                <w:rFonts w:ascii="Consolas" w:eastAsia="Times New Roman" w:hAnsi="Consolas" w:cs="Courier New"/>
+                <w:lang w:eastAsia="pt-BR"/>
+              </w:rPr>
+              <w:t>ECS_SUBNET_IDS</w:t>
+            </w:r>
+          </w:p>
+        </w:tc>
+        <w:tc>
+          <w:tcPr>
+            <w:tcW w:w="0" w:type="auto"/>
+            <w:tcBorders>
+              <w:right w:val="nil"/>
+            </w:tcBorders>
+            <w:tcMar>
+              <w:top w:w="75" w:type="dxa"/>
+              <w:left w:w="135" w:type="dxa"/>
+              <w:bottom w:w="75" w:type="dxa"/>
+              <w:right w:w="135" w:type="dxa"/>
+            </w:tcMar>
+            <w:hideMark/>
+          </w:tcPr>
+          <w:p>
+            <w:pPr>
+              <w:spacing w:after="0" w:line="240" w:lineRule="auto"/>
+              <w:rPr>
+                <w:rFonts w:ascii="Times New Roman" w:eastAsia="Times New Roman" w:hAnsi="Times New Roman" w:cs="Times New Roman"/>
+                <w:sz w:val="24"/>
+                <w:szCs w:val="24"/>
+                <w:lang w:eastAsia="pt-BR"/>
+              </w:rPr>
+            </w:pPr>
+            <w:r>
+              <w:rPr>
+                <w:rFonts w:ascii="Consolas" w:eastAsia="Times New Roman" w:hAnsi="Consolas" w:cs="Courier New"/>
+                <w:lang w:eastAsia="pt-BR"/>
+              </w:rPr>
+              <w:t>subnet-0dbae3fa</w:t>
+            </w:r>
+            <w:proofErr w:type="gramStart"/>
+            <w:r>
+              <w:rPr>
+                <w:rFonts w:ascii="Consolas" w:eastAsia="Times New Roman" w:hAnsi="Consolas" w:cs="Courier New"/>
+                <w:lang w:eastAsia="pt-BR"/>
+              </w:rPr>
+              <w:t>095281588,subnet</w:t>
+            </w:r>
+            <w:proofErr w:type="gramEnd"/>
+            <w:r>
+              <w:rPr>
+                <w:rFonts w:ascii="Consolas" w:eastAsia="Times New Roman" w:hAnsi="Consolas" w:cs="Courier New"/>
+                <w:lang w:eastAsia="pt-BR"/>
+              </w:rPr>
+              <w:t>-02d7eb853e18474e2</w:t>
+            </w:r>
+          </w:p>
+        </w:tc>
+      </w:tr>
+      <w:tr>
+        <w:tc>
+          <w:tcPr>
+            <w:tcW w:w="0" w:type="auto"/>
+            <w:tcBorders>
+              <w:bottom w:val="nil"/>
+            </w:tcBorders>
+            <w:tcMar>
+              <w:top w:w="75" w:type="dxa"/>
+              <w:left w:w="135" w:type="dxa"/>
+              <w:bottom w:w="75" w:type="dxa"/>
+              <w:right w:w="135" w:type="dxa"/>
+            </w:tcMar>
+            <w:hideMark/>
+          </w:tcPr>
+          <w:p>
+            <w:pPr>
+              <w:spacing w:after="0" w:line="240" w:lineRule="auto"/>
+              <w:rPr>
+                <w:rFonts w:ascii="Times New Roman" w:eastAsia="Times New Roman" w:hAnsi="Times New Roman" w:cs="Times New Roman"/>
+                <w:sz w:val="24"/>
+                <w:szCs w:val="24"/>
+                <w:lang w:eastAsia="pt-BR"/>
+              </w:rPr>
+            </w:pPr>
+            <w:r>
+              <w:rPr>
+                <w:rFonts w:ascii="Consolas" w:eastAsia="Times New Roman" w:hAnsi="Consolas" w:cs="Courier New"/>
+                <w:lang w:eastAsia="pt-BR"/>
+              </w:rPr>
+              <w:t>ECS_SECURITY_GROUP_ID</w:t>
+            </w:r>
+          </w:p>
+        </w:tc>
+        <w:tc>
+          <w:tcPr>
+            <w:tcW w:w="0" w:type="auto"/>
+            <w:tcBorders>
+              <w:bottom w:val="nil"/>
+              <w:right w:val="nil"/>
+            </w:tcBorders>
+            <w:tcMar>
+              <w:top w:w="75" w:type="dxa"/>
+              <w:left w:w="135" w:type="dxa"/>
+              <w:bottom w:w="75" w:type="dxa"/>
+              <w:right w:w="135" w:type="dxa"/>
+            </w:tcMar>
+            <w:hideMark/>
+          </w:tcPr>
+          <w:p>
+            <w:pPr>
+              <w:spacing w:after="0" w:line="240" w:lineRule="auto"/>
+              <w:rPr>
+                <w:rFonts w:ascii="Times New Roman" w:eastAsia="Times New Roman" w:hAnsi="Times New Roman" w:cs="Times New Roman"/>
+                <w:sz w:val="24"/>
+                <w:szCs w:val="24"/>
+                <w:lang w:eastAsia="pt-BR"/>
+              </w:rPr>
+            </w:pPr>
+            <w:r>
+              <w:rPr>
+                <w:rFonts w:ascii="Consolas" w:eastAsia="Times New Roman" w:hAnsi="Consolas" w:cs="Courier New"/>
+                <w:lang w:eastAsia="pt-BR"/>
+              </w:rPr>
+              <w:t>sg-0e6cca6772ed01959</w:t>
+            </w:r>
+          </w:p>
+        </w:tc>
+      </w:tr>
+    </w:tbl>
+    <w:p>
+      <w:pPr>
+        <w:rPr>
+          <w:rFonts w:cstheme="minorHAnsi"/>
+        </w:rPr>
+      </w:pPr>
+    </w:p>
+    <w:p>
+      <w:pPr>
+        <w:rPr>
+          <w:rFonts w:cstheme="minorHAnsi"/>
+          <w:u w:val="single"/>
+        </w:rPr>
+      </w:pPr>
+      <w:r>
+        <w:rPr>
+          <w:rFonts w:cstheme="minorHAnsi"/>
+          <w:u w:val="single"/>
+        </w:rPr>
+        <w:t>Pegando os valores</w:t>
+      </w:r>
+    </w:p>
+    <w:p>
+      <w:pPr>
+        <w:rPr>
+          <w:rFonts w:cstheme="minorHAnsi"/>
+          <w:u w:val="single"/>
+        </w:rPr>
+      </w:pPr>
+    </w:p>
+    <w:p>
+      <w:pPr>
+        <w:pStyle w:val="Ttulo3"/>
+        <w:shd w:val="clear" w:color="auto" w:fill="1E2127"/>
+        <w:spacing w:before="270" w:after="120"/>
+        <w:rPr>
+          <w:rFonts w:ascii="Segoe UI" w:hAnsi="Segoe UI" w:cs="Segoe UI"/>
+          <w:color w:val="7B88A1"/>
+          <w:sz w:val="28"/>
+          <w:szCs w:val="28"/>
+        </w:rPr>
+      </w:pPr>
+      <w:r>
+        <w:rPr>
+          <w:rFonts w:ascii="Segoe UI" w:hAnsi="Segoe UI" w:cs="Segoe UI"/>
+          <w:color w:val="7B88A1"/>
+          <w:sz w:val="28"/>
+          <w:szCs w:val="28"/>
+        </w:rPr>
+        <w:t>Script para copiar tudo de uma vez (</w:t>
+      </w:r>
+      <w:proofErr w:type="spellStart"/>
+      <w:r>
+        <w:rPr>
+          <w:rFonts w:ascii="Segoe UI" w:hAnsi="Segoe UI" w:cs="Segoe UI"/>
+          <w:color w:val="7B88A1"/>
+          <w:sz w:val="28"/>
+          <w:szCs w:val="28"/>
+        </w:rPr>
+        <w:t>bash</w:t>
+      </w:r>
+      <w:proofErr w:type="spellEnd"/>
+      <w:r>
+        <w:rPr>
+          <w:rFonts w:ascii="Segoe UI" w:hAnsi="Segoe UI" w:cs="Segoe UI"/>
+          <w:color w:val="7B88A1"/>
+          <w:sz w:val="28"/>
+          <w:szCs w:val="28"/>
+        </w:rPr>
+        <w:t>/</w:t>
+      </w:r>
+      <w:proofErr w:type="spellStart"/>
+      <w:r>
+        <w:rPr>
+          <w:rFonts w:ascii="Segoe UI" w:hAnsi="Segoe UI" w:cs="Segoe UI"/>
+          <w:color w:val="7B88A1"/>
+          <w:sz w:val="28"/>
+          <w:szCs w:val="28"/>
+        </w:rPr>
+        <w:t>Git</w:t>
+      </w:r>
+      <w:proofErr w:type="spellEnd"/>
+      <w:r>
+        <w:rPr>
+          <w:rFonts w:ascii="Segoe UI" w:hAnsi="Segoe UI" w:cs="Segoe UI"/>
+          <w:color w:val="7B88A1"/>
+          <w:sz w:val="28"/>
+          <w:szCs w:val="28"/>
+        </w:rPr>
+        <w:t xml:space="preserve"> </w:t>
+      </w:r>
+      <w:proofErr w:type="spellStart"/>
+      <w:r>
+        <w:rPr>
+          <w:rFonts w:ascii="Segoe UI" w:hAnsi="Segoe UI" w:cs="Segoe UI"/>
+          <w:color w:val="7B88A1"/>
+          <w:sz w:val="28"/>
+          <w:szCs w:val="28"/>
+        </w:rPr>
+        <w:t>Bash</w:t>
+      </w:r>
+      <w:proofErr w:type="spellEnd"/>
+      <w:r>
+        <w:rPr>
+          <w:rFonts w:ascii="Segoe UI" w:hAnsi="Segoe UI" w:cs="Segoe UI"/>
+          <w:color w:val="7B88A1"/>
+          <w:sz w:val="28"/>
+          <w:szCs w:val="28"/>
+        </w:rPr>
+        <w:t>)</w:t>
+      </w:r>
+    </w:p>
+    <w:p>
+      <w:pPr>
+        <w:shd w:val="clear" w:color="auto" w:fill="1E2127"/>
+        <w:spacing w:line="300" w:lineRule="atLeast"/>
+        <w:rPr>
+          <w:rFonts w:ascii="Consolas" w:hAnsi="Consolas" w:cs="Segoe UI"/>
+          <w:color w:val="7B88A1"/>
+          <w:sz w:val="18"/>
+          <w:szCs w:val="18"/>
+        </w:rPr>
+      </w:pPr>
+      <w:proofErr w:type="spellStart"/>
+      <w:r>
+        <w:rPr>
+          <w:rFonts w:ascii="Consolas" w:hAnsi="Consolas" w:cs="Segoe UI"/>
+          <w:color w:val="88C0D0"/>
+          <w:sz w:val="18"/>
+          <w:szCs w:val="18"/>
+        </w:rPr>
+        <w:t>cd</w:t>
+      </w:r>
+      <w:proofErr w:type="spellEnd"/>
+      <w:r>
+        <w:rPr>
+          <w:rFonts w:ascii="Consolas" w:hAnsi="Consolas" w:cs="Segoe UI"/>
+          <w:color w:val="7B88A1"/>
+          <w:sz w:val="18"/>
+          <w:szCs w:val="18"/>
+        </w:rPr>
+        <w:t xml:space="preserve"> </w:t>
+      </w:r>
+      <w:proofErr w:type="spellStart"/>
+      <w:r>
+        <w:rPr>
+          <w:rFonts w:ascii="Consolas" w:hAnsi="Consolas" w:cs="Segoe UI"/>
+          <w:color w:val="A3BE8C"/>
+          <w:sz w:val="18"/>
+          <w:szCs w:val="18"/>
+        </w:rPr>
+        <w:t>terraform</w:t>
+      </w:r>
+      <w:proofErr w:type="spellEnd"/>
+    </w:p>
+    <w:p>
+      <w:pPr>
+        <w:shd w:val="clear" w:color="auto" w:fill="1E2127"/>
+        <w:spacing w:line="300" w:lineRule="atLeast"/>
+        <w:rPr>
+          <w:rFonts w:ascii="Consolas" w:hAnsi="Consolas" w:cs="Segoe UI"/>
+          <w:color w:val="7B88A1"/>
+          <w:sz w:val="18"/>
+          <w:szCs w:val="18"/>
+        </w:rPr>
+      </w:pPr>
+      <w:proofErr w:type="spellStart"/>
+      <w:r>
+        <w:rPr>
+          <w:rFonts w:ascii="Consolas" w:hAnsi="Consolas" w:cs="Segoe UI"/>
+          <w:color w:val="88C0D0"/>
+          <w:sz w:val="18"/>
+          <w:szCs w:val="18"/>
+        </w:rPr>
+        <w:t>echo</w:t>
+      </w:r>
+      <w:proofErr w:type="spellEnd"/>
+      <w:r>
+        <w:rPr>
+          <w:rFonts w:ascii="Consolas" w:hAnsi="Consolas" w:cs="Segoe UI"/>
+          <w:color w:val="7B88A1"/>
+          <w:sz w:val="18"/>
+          <w:szCs w:val="18"/>
+        </w:rPr>
+        <w:t xml:space="preserve"> </w:t>
+      </w:r>
+      <w:r>
+        <w:rPr>
+          <w:rFonts w:ascii="Consolas" w:hAnsi="Consolas" w:cs="Segoe UI"/>
+          <w:color w:val="ECEFF4"/>
+          <w:sz w:val="18"/>
+          <w:szCs w:val="18"/>
+        </w:rPr>
+        <w:t>"</w:t>
+      </w:r>
+      <w:r>
+        <w:rPr>
+          <w:rFonts w:ascii="Consolas" w:hAnsi="Consolas" w:cs="Segoe UI"/>
+          <w:color w:val="A3BE8C"/>
+          <w:sz w:val="18"/>
+          <w:szCs w:val="18"/>
+        </w:rPr>
+        <w:t>AWS_ROLE_ARN=</w:t>
+      </w:r>
+      <w:r>
+        <w:rPr>
+          <w:rFonts w:ascii="Consolas" w:hAnsi="Consolas" w:cs="Segoe UI"/>
+          <w:color w:val="ECEFF4"/>
+          <w:sz w:val="18"/>
+          <w:szCs w:val="18"/>
+        </w:rPr>
+        <w:t>$(</w:t>
+      </w:r>
+      <w:proofErr w:type="spellStart"/>
+      <w:r>
+        <w:rPr>
+          <w:rFonts w:ascii="Consolas" w:hAnsi="Consolas" w:cs="Segoe UI"/>
+          <w:color w:val="88C0D0"/>
+          <w:sz w:val="18"/>
+          <w:szCs w:val="18"/>
+        </w:rPr>
+        <w:t>terraform</w:t>
+      </w:r>
+      <w:proofErr w:type="spellEnd"/>
+      <w:r>
+        <w:rPr>
+          <w:rFonts w:ascii="Consolas" w:hAnsi="Consolas" w:cs="Segoe UI"/>
+          <w:color w:val="A3BE8C"/>
+          <w:sz w:val="18"/>
+          <w:szCs w:val="18"/>
+        </w:rPr>
+        <w:t xml:space="preserve"> output </w:t>
+      </w:r>
+      <w:r>
+        <w:rPr>
+          <w:rFonts w:ascii="Consolas" w:hAnsi="Consolas" w:cs="Segoe UI"/>
+          <w:color w:val="F8C762"/>
+          <w:sz w:val="18"/>
+          <w:szCs w:val="18"/>
+        </w:rPr>
+        <w:t>-</w:t>
+      </w:r>
+      <w:proofErr w:type="spellStart"/>
+      <w:r>
+        <w:rPr>
+          <w:rFonts w:ascii="Consolas" w:hAnsi="Consolas" w:cs="Segoe UI"/>
+          <w:color w:val="F8C762"/>
+          <w:sz w:val="18"/>
+          <w:szCs w:val="18"/>
+        </w:rPr>
+        <w:t>raw</w:t>
+      </w:r>
+      <w:proofErr w:type="spellEnd"/>
+      <w:r>
+        <w:rPr>
+          <w:rFonts w:ascii="Consolas" w:hAnsi="Consolas" w:cs="Segoe UI"/>
+          <w:color w:val="A3BE8C"/>
+          <w:sz w:val="18"/>
+          <w:szCs w:val="18"/>
+        </w:rPr>
+        <w:t xml:space="preserve"> </w:t>
+      </w:r>
+      <w:proofErr w:type="spellStart"/>
+      <w:r>
+        <w:rPr>
+          <w:rFonts w:ascii="Consolas" w:hAnsi="Consolas" w:cs="Segoe UI"/>
+          <w:color w:val="A3BE8C"/>
+          <w:sz w:val="18"/>
+          <w:szCs w:val="18"/>
+        </w:rPr>
+        <w:t>github_actions_role_arn</w:t>
+      </w:r>
+      <w:proofErr w:type="spellEnd"/>
+      <w:r>
+        <w:rPr>
+          <w:rFonts w:ascii="Consolas" w:hAnsi="Consolas" w:cs="Segoe UI"/>
+          <w:color w:val="ECEFF4"/>
+          <w:sz w:val="18"/>
+          <w:szCs w:val="18"/>
+        </w:rPr>
+        <w:t>)"</w:t>
+      </w:r>
+    </w:p>
+    <w:p>
+      <w:pPr>
+        <w:shd w:val="clear" w:color="auto" w:fill="1E2127"/>
+        <w:spacing w:line="300" w:lineRule="atLeast"/>
+        <w:rPr>
+          <w:rFonts w:ascii="Consolas" w:hAnsi="Consolas" w:cs="Segoe UI"/>
+          <w:color w:val="7B88A1"/>
+          <w:sz w:val="18"/>
+          <w:szCs w:val="18"/>
+        </w:rPr>
+      </w:pPr>
+      <w:proofErr w:type="spellStart"/>
+      <w:r>
+        <w:rPr>
+          <w:rFonts w:ascii="Consolas" w:hAnsi="Consolas" w:cs="Segoe UI"/>
+          <w:color w:val="88C0D0"/>
+          <w:sz w:val="18"/>
+          <w:szCs w:val="18"/>
+        </w:rPr>
+        <w:t>echo</w:t>
+      </w:r>
+      <w:proofErr w:type="spellEnd"/>
+      <w:r>
+        <w:rPr>
+          <w:rFonts w:ascii="Consolas" w:hAnsi="Consolas" w:cs="Segoe UI"/>
+          <w:color w:val="7B88A1"/>
+          <w:sz w:val="18"/>
+          <w:szCs w:val="18"/>
+        </w:rPr>
+        <w:t xml:space="preserve"> </w:t>
+      </w:r>
+      <w:r>
+        <w:rPr>
+          <w:rFonts w:ascii="Consolas" w:hAnsi="Consolas" w:cs="Segoe UI"/>
+          <w:color w:val="ECEFF4"/>
+          <w:sz w:val="18"/>
+          <w:szCs w:val="18"/>
+        </w:rPr>
+        <w:t>"</w:t>
+      </w:r>
+      <w:r>
+        <w:rPr>
+          <w:rFonts w:ascii="Consolas" w:hAnsi="Consolas" w:cs="Segoe UI"/>
+          <w:color w:val="A3BE8C"/>
+          <w:sz w:val="18"/>
+          <w:szCs w:val="18"/>
+        </w:rPr>
+        <w:t>ECR_REPOSITORY_NAME=</w:t>
+      </w:r>
+      <w:r>
+        <w:rPr>
+          <w:rFonts w:ascii="Consolas" w:hAnsi="Consolas" w:cs="Segoe UI"/>
+          <w:color w:val="ECEFF4"/>
+          <w:sz w:val="18"/>
+          <w:szCs w:val="18"/>
+        </w:rPr>
+        <w:t>$(</w:t>
+      </w:r>
+      <w:proofErr w:type="spellStart"/>
+      <w:r>
+        <w:rPr>
+          <w:rFonts w:ascii="Consolas" w:hAnsi="Consolas" w:cs="Segoe UI"/>
+          <w:color w:val="88C0D0"/>
+          <w:sz w:val="18"/>
+          <w:szCs w:val="18"/>
+        </w:rPr>
+        <w:t>terraform</w:t>
+      </w:r>
+      <w:proofErr w:type="spellEnd"/>
+      <w:r>
+        <w:rPr>
+          <w:rFonts w:ascii="Consolas" w:hAnsi="Consolas" w:cs="Segoe UI"/>
+          <w:color w:val="A3BE8C"/>
+          <w:sz w:val="18"/>
+          <w:szCs w:val="18"/>
+        </w:rPr>
+        <w:t xml:space="preserve"> output </w:t>
+      </w:r>
+      <w:r>
+        <w:rPr>
+          <w:rFonts w:ascii="Consolas" w:hAnsi="Consolas" w:cs="Segoe UI"/>
+          <w:color w:val="F8C762"/>
+          <w:sz w:val="18"/>
+          <w:szCs w:val="18"/>
+        </w:rPr>
+        <w:t>-</w:t>
+      </w:r>
+      <w:proofErr w:type="spellStart"/>
+      <w:r>
+        <w:rPr>
+          <w:rFonts w:ascii="Consolas" w:hAnsi="Consolas" w:cs="Segoe UI"/>
+          <w:color w:val="F8C762"/>
+          <w:sz w:val="18"/>
+          <w:szCs w:val="18"/>
+        </w:rPr>
+        <w:t>raw</w:t>
+      </w:r>
+      <w:proofErr w:type="spellEnd"/>
+      <w:r>
+        <w:rPr>
+          <w:rFonts w:ascii="Consolas" w:hAnsi="Consolas" w:cs="Segoe UI"/>
+          <w:color w:val="A3BE8C"/>
+          <w:sz w:val="18"/>
+          <w:szCs w:val="18"/>
+        </w:rPr>
+        <w:t xml:space="preserve"> </w:t>
+      </w:r>
+      <w:proofErr w:type="spellStart"/>
+      <w:r>
+        <w:rPr>
+          <w:rFonts w:ascii="Consolas" w:hAnsi="Consolas" w:cs="Segoe UI"/>
+          <w:color w:val="A3BE8C"/>
+          <w:sz w:val="18"/>
+          <w:szCs w:val="18"/>
+        </w:rPr>
+        <w:t>ecr_repository_url</w:t>
+      </w:r>
+      <w:proofErr w:type="spellEnd"/>
+      <w:r>
+        <w:rPr>
+          <w:rFonts w:ascii="Consolas" w:hAnsi="Consolas" w:cs="Segoe UI"/>
+          <w:color w:val="A3BE8C"/>
+          <w:sz w:val="18"/>
+          <w:szCs w:val="18"/>
+        </w:rPr>
+        <w:t xml:space="preserve"> </w:t>
+      </w:r>
+      <w:r>
+        <w:rPr>
+          <w:rFonts w:ascii="Consolas" w:hAnsi="Consolas" w:cs="Segoe UI"/>
+          <w:color w:val="ECEFF4"/>
+          <w:sz w:val="18"/>
+          <w:szCs w:val="18"/>
+        </w:rPr>
+        <w:t>|</w:t>
+      </w:r>
+      <w:r>
+        <w:rPr>
+          <w:rFonts w:ascii="Consolas" w:hAnsi="Consolas" w:cs="Segoe UI"/>
+          <w:color w:val="A3BE8C"/>
+          <w:sz w:val="18"/>
+          <w:szCs w:val="18"/>
+        </w:rPr>
+        <w:t xml:space="preserve"> </w:t>
+      </w:r>
+      <w:proofErr w:type="spellStart"/>
+      <w:r>
+        <w:rPr>
+          <w:rFonts w:ascii="Consolas" w:hAnsi="Consolas" w:cs="Segoe UI"/>
+          <w:color w:val="88C0D0"/>
+          <w:sz w:val="18"/>
+          <w:szCs w:val="18"/>
+        </w:rPr>
+        <w:t>sed</w:t>
+      </w:r>
+      <w:proofErr w:type="spellEnd"/>
+      <w:r>
+        <w:rPr>
+          <w:rFonts w:ascii="Consolas" w:hAnsi="Consolas" w:cs="Segoe UI"/>
+          <w:color w:val="A3BE8C"/>
+          <w:sz w:val="18"/>
+          <w:szCs w:val="18"/>
+        </w:rPr>
+        <w:t xml:space="preserve"> </w:t>
+      </w:r>
+      <w:r>
+        <w:rPr>
+          <w:rFonts w:ascii="Consolas" w:hAnsi="Consolas" w:cs="Segoe UI"/>
+          <w:color w:val="ECEFF4"/>
+          <w:sz w:val="18"/>
+          <w:szCs w:val="18"/>
+        </w:rPr>
+        <w:t>'</w:t>
+      </w:r>
+      <w:r>
+        <w:rPr>
+          <w:rFonts w:ascii="Consolas" w:hAnsi="Consolas" w:cs="Segoe UI"/>
+          <w:color w:val="A3BE8C"/>
+          <w:sz w:val="18"/>
+          <w:szCs w:val="18"/>
+        </w:rPr>
+        <w:t>s</w:t>
+      </w:r>
+      <w:proofErr w:type="gramStart"/>
+      <w:r>
+        <w:rPr>
+          <w:rFonts w:ascii="Consolas" w:hAnsi="Consolas" w:cs="Segoe UI"/>
+          <w:color w:val="A3BE8C"/>
+          <w:sz w:val="18"/>
+          <w:szCs w:val="18"/>
+        </w:rPr>
+        <w:t>|.*</w:t>
+      </w:r>
+      <w:proofErr w:type="gramEnd"/>
+      <w:r>
+        <w:rPr>
+          <w:rFonts w:ascii="Consolas" w:hAnsi="Consolas" w:cs="Segoe UI"/>
+          <w:color w:val="A3BE8C"/>
+          <w:sz w:val="18"/>
+          <w:szCs w:val="18"/>
+        </w:rPr>
+        <w:t>/||</w:t>
+      </w:r>
+      <w:r>
+        <w:rPr>
+          <w:rFonts w:ascii="Consolas" w:hAnsi="Consolas" w:cs="Segoe UI"/>
+          <w:color w:val="ECEFF4"/>
+          <w:sz w:val="18"/>
+          <w:szCs w:val="18"/>
+        </w:rPr>
+        <w:t>')"</w:t>
+      </w:r>
+    </w:p>
+    <w:p>
+      <w:pPr>
+        <w:shd w:val="clear" w:color="auto" w:fill="1E2127"/>
+        <w:spacing w:line="300" w:lineRule="atLeast"/>
+        <w:rPr>
+          <w:rFonts w:ascii="Consolas" w:hAnsi="Consolas" w:cs="Segoe UI"/>
+          <w:color w:val="7B88A1"/>
+          <w:sz w:val="18"/>
+          <w:szCs w:val="18"/>
+        </w:rPr>
+      </w:pPr>
+      <w:proofErr w:type="spellStart"/>
+      <w:r>
+        <w:rPr>
+          <w:rFonts w:ascii="Consolas" w:hAnsi="Consolas" w:cs="Segoe UI"/>
+          <w:color w:val="88C0D0"/>
+          <w:sz w:val="18"/>
+          <w:szCs w:val="18"/>
+        </w:rPr>
+        <w:t>echo</w:t>
+      </w:r>
+      <w:proofErr w:type="spellEnd"/>
+      <w:r>
+        <w:rPr>
+          <w:rFonts w:ascii="Consolas" w:hAnsi="Consolas" w:cs="Segoe UI"/>
+          <w:color w:val="7B88A1"/>
+          <w:sz w:val="18"/>
+          <w:szCs w:val="18"/>
+        </w:rPr>
+        <w:t xml:space="preserve"> </w:t>
+      </w:r>
+      <w:r>
+        <w:rPr>
+          <w:rFonts w:ascii="Consolas" w:hAnsi="Consolas" w:cs="Segoe UI"/>
+          <w:color w:val="ECEFF4"/>
+          <w:sz w:val="18"/>
+          <w:szCs w:val="18"/>
+        </w:rPr>
+        <w:t>"</w:t>
+      </w:r>
+      <w:r>
+        <w:rPr>
+          <w:rFonts w:ascii="Consolas" w:hAnsi="Consolas" w:cs="Segoe UI"/>
+          <w:color w:val="A3BE8C"/>
+          <w:sz w:val="18"/>
+          <w:szCs w:val="18"/>
+        </w:rPr>
+        <w:t>ECS_CLUSTER_NAME=</w:t>
+      </w:r>
+      <w:r>
+        <w:rPr>
+          <w:rFonts w:ascii="Consolas" w:hAnsi="Consolas" w:cs="Segoe UI"/>
+          <w:color w:val="ECEFF4"/>
+          <w:sz w:val="18"/>
+          <w:szCs w:val="18"/>
+        </w:rPr>
+        <w:t>$(</w:t>
+      </w:r>
+      <w:proofErr w:type="spellStart"/>
+      <w:r>
+        <w:rPr>
+          <w:rFonts w:ascii="Consolas" w:hAnsi="Consolas" w:cs="Segoe UI"/>
+          <w:color w:val="88C0D0"/>
+          <w:sz w:val="18"/>
+          <w:szCs w:val="18"/>
+        </w:rPr>
+        <w:t>terraform</w:t>
+      </w:r>
+      <w:proofErr w:type="spellEnd"/>
+      <w:r>
+        <w:rPr>
+          <w:rFonts w:ascii="Consolas" w:hAnsi="Consolas" w:cs="Segoe UI"/>
+          <w:color w:val="A3BE8C"/>
+          <w:sz w:val="18"/>
+          <w:szCs w:val="18"/>
+        </w:rPr>
+        <w:t xml:space="preserve"> output </w:t>
+      </w:r>
+      <w:r>
+        <w:rPr>
+          <w:rFonts w:ascii="Consolas" w:hAnsi="Consolas" w:cs="Segoe UI"/>
+          <w:color w:val="F8C762"/>
+          <w:sz w:val="18"/>
+          <w:szCs w:val="18"/>
+        </w:rPr>
+        <w:t>-</w:t>
+      </w:r>
+      <w:proofErr w:type="spellStart"/>
+      <w:r>
+        <w:rPr>
+          <w:rFonts w:ascii="Consolas" w:hAnsi="Consolas" w:cs="Segoe UI"/>
+          <w:color w:val="F8C762"/>
+          <w:sz w:val="18"/>
+          <w:szCs w:val="18"/>
+        </w:rPr>
+        <w:t>raw</w:t>
+      </w:r>
+      <w:proofErr w:type="spellEnd"/>
+      <w:r>
+        <w:rPr>
+          <w:rFonts w:ascii="Consolas" w:hAnsi="Consolas" w:cs="Segoe UI"/>
+          <w:color w:val="A3BE8C"/>
+          <w:sz w:val="18"/>
+          <w:szCs w:val="18"/>
+        </w:rPr>
+        <w:t xml:space="preserve"> </w:t>
+      </w:r>
+      <w:proofErr w:type="spellStart"/>
+      <w:r>
+        <w:rPr>
+          <w:rFonts w:ascii="Consolas" w:hAnsi="Consolas" w:cs="Segoe UI"/>
+          <w:color w:val="A3BE8C"/>
+          <w:sz w:val="18"/>
+          <w:szCs w:val="18"/>
+        </w:rPr>
+        <w:t>ecs_cluster_name</w:t>
+      </w:r>
+      <w:proofErr w:type="spellEnd"/>
+      <w:r>
+        <w:rPr>
+          <w:rFonts w:ascii="Consolas" w:hAnsi="Consolas" w:cs="Segoe UI"/>
+          <w:color w:val="ECEFF4"/>
+          <w:sz w:val="18"/>
+          <w:szCs w:val="18"/>
+        </w:rPr>
+        <w:t>)"</w:t>
+      </w:r>
+    </w:p>
+    <w:p>
+      <w:pPr>
+        <w:shd w:val="clear" w:color="auto" w:fill="1E2127"/>
+        <w:spacing w:line="300" w:lineRule="atLeast"/>
+        <w:rPr>
+          <w:rFonts w:ascii="Consolas" w:hAnsi="Consolas" w:cs="Segoe UI"/>
+          <w:color w:val="7B88A1"/>
+          <w:sz w:val="18"/>
+          <w:szCs w:val="18"/>
+        </w:rPr>
+      </w:pPr>
+      <w:proofErr w:type="spellStart"/>
+      <w:r>
+        <w:rPr>
+          <w:rFonts w:ascii="Consolas" w:hAnsi="Consolas" w:cs="Segoe UI"/>
+          <w:color w:val="88C0D0"/>
+          <w:sz w:val="18"/>
+          <w:szCs w:val="18"/>
+        </w:rPr>
+        <w:t>echo</w:t>
+      </w:r>
+      <w:proofErr w:type="spellEnd"/>
+      <w:r>
+        <w:rPr>
+          <w:rFonts w:ascii="Consolas" w:hAnsi="Consolas" w:cs="Segoe UI"/>
+          <w:color w:val="7B88A1"/>
+          <w:sz w:val="18"/>
+          <w:szCs w:val="18"/>
+        </w:rPr>
+        <w:t xml:space="preserve"> </w:t>
+      </w:r>
+      <w:r>
+        <w:rPr>
+          <w:rFonts w:ascii="Consolas" w:hAnsi="Consolas" w:cs="Segoe UI"/>
+          <w:color w:val="ECEFF4"/>
+          <w:sz w:val="18"/>
+          <w:szCs w:val="18"/>
+        </w:rPr>
+        <w:t>"</w:t>
+      </w:r>
+      <w:r>
+        <w:rPr>
+          <w:rFonts w:ascii="Consolas" w:hAnsi="Consolas" w:cs="Segoe UI"/>
+          <w:color w:val="A3BE8C"/>
+          <w:sz w:val="18"/>
+          <w:szCs w:val="18"/>
+        </w:rPr>
+        <w:t>ECS_TASK_DEFINITION_FAMILY=</w:t>
+      </w:r>
+      <w:r>
+        <w:rPr>
+          <w:rFonts w:ascii="Consolas" w:hAnsi="Consolas" w:cs="Segoe UI"/>
+          <w:color w:val="ECEFF4"/>
+          <w:sz w:val="18"/>
+          <w:szCs w:val="18"/>
+        </w:rPr>
+        <w:t>$(</w:t>
+      </w:r>
+      <w:proofErr w:type="spellStart"/>
+      <w:r>
+        <w:rPr>
+          <w:rFonts w:ascii="Consolas" w:hAnsi="Consolas" w:cs="Segoe UI"/>
+          <w:color w:val="88C0D0"/>
+          <w:sz w:val="18"/>
+          <w:szCs w:val="18"/>
+        </w:rPr>
+        <w:t>terraform</w:t>
+      </w:r>
+      <w:proofErr w:type="spellEnd"/>
+      <w:r>
+        <w:rPr>
+          <w:rFonts w:ascii="Consolas" w:hAnsi="Consolas" w:cs="Segoe UI"/>
+          <w:color w:val="A3BE8C"/>
+          <w:sz w:val="18"/>
+          <w:szCs w:val="18"/>
+        </w:rPr>
+        <w:t xml:space="preserve"> output </w:t>
+      </w:r>
+      <w:r>
+        <w:rPr>
+          <w:rFonts w:ascii="Consolas" w:hAnsi="Consolas" w:cs="Segoe UI"/>
+          <w:color w:val="F8C762"/>
+          <w:sz w:val="18"/>
+          <w:szCs w:val="18"/>
+        </w:rPr>
+        <w:t>-</w:t>
+      </w:r>
+      <w:proofErr w:type="spellStart"/>
+      <w:r>
+        <w:rPr>
+          <w:rFonts w:ascii="Consolas" w:hAnsi="Consolas" w:cs="Segoe UI"/>
+          <w:color w:val="F8C762"/>
+          <w:sz w:val="18"/>
+          <w:szCs w:val="18"/>
+        </w:rPr>
+        <w:t>raw</w:t>
+      </w:r>
+      <w:proofErr w:type="spellEnd"/>
+      <w:r>
+        <w:rPr>
+          <w:rFonts w:ascii="Consolas" w:hAnsi="Consolas" w:cs="Segoe UI"/>
+          <w:color w:val="A3BE8C"/>
+          <w:sz w:val="18"/>
+          <w:szCs w:val="18"/>
+        </w:rPr>
+        <w:t xml:space="preserve"> </w:t>
+      </w:r>
+      <w:proofErr w:type="spellStart"/>
+      <w:r>
+        <w:rPr>
+          <w:rFonts w:ascii="Consolas" w:hAnsi="Consolas" w:cs="Segoe UI"/>
+          <w:color w:val="A3BE8C"/>
+          <w:sz w:val="18"/>
+          <w:szCs w:val="18"/>
+        </w:rPr>
+        <w:t>ecs_task_definition_family</w:t>
+      </w:r>
+      <w:proofErr w:type="spellEnd"/>
+      <w:r>
+        <w:rPr>
+          <w:rFonts w:ascii="Consolas" w:hAnsi="Consolas" w:cs="Segoe UI"/>
+          <w:color w:val="ECEFF4"/>
+          <w:sz w:val="18"/>
+          <w:szCs w:val="18"/>
+        </w:rPr>
+        <w:t>)"</w:t>
+      </w:r>
+    </w:p>
+    <w:p>
+      <w:pPr>
+        <w:shd w:val="clear" w:color="auto" w:fill="1E2127"/>
+        <w:spacing w:line="300" w:lineRule="atLeast"/>
+        <w:rPr>
+          <w:rFonts w:ascii="Consolas" w:hAnsi="Consolas" w:cs="Segoe UI"/>
+          <w:color w:val="7B88A1"/>
+          <w:sz w:val="18"/>
+          <w:szCs w:val="18"/>
+        </w:rPr>
+      </w:pPr>
+      <w:proofErr w:type="spellStart"/>
+      <w:r>
+        <w:rPr>
+          <w:rFonts w:ascii="Consolas" w:hAnsi="Consolas" w:cs="Segoe UI"/>
+          <w:color w:val="88C0D0"/>
+          <w:sz w:val="18"/>
+          <w:szCs w:val="18"/>
+        </w:rPr>
+        <w:t>echo</w:t>
+      </w:r>
+      <w:proofErr w:type="spellEnd"/>
+      <w:r>
+        <w:rPr>
+          <w:rFonts w:ascii="Consolas" w:hAnsi="Consolas" w:cs="Segoe UI"/>
+          <w:color w:val="7B88A1"/>
+          <w:sz w:val="18"/>
+          <w:szCs w:val="18"/>
+        </w:rPr>
+        <w:t xml:space="preserve"> </w:t>
+      </w:r>
+      <w:r>
+        <w:rPr>
+          <w:rFonts w:ascii="Consolas" w:hAnsi="Consolas" w:cs="Segoe UI"/>
+          <w:color w:val="ECEFF4"/>
+          <w:sz w:val="18"/>
+          <w:szCs w:val="18"/>
+        </w:rPr>
+        <w:t>"</w:t>
+      </w:r>
+      <w:r>
+        <w:rPr>
+          <w:rFonts w:ascii="Consolas" w:hAnsi="Consolas" w:cs="Segoe UI"/>
+          <w:color w:val="A3BE8C"/>
+          <w:sz w:val="18"/>
+          <w:szCs w:val="18"/>
+        </w:rPr>
+        <w:t>ECS_CONTAINER_NAME=</w:t>
+      </w:r>
+      <w:r>
+        <w:rPr>
+          <w:rFonts w:ascii="Consolas" w:hAnsi="Consolas" w:cs="Segoe UI"/>
+          <w:color w:val="ECEFF4"/>
+          <w:sz w:val="18"/>
+          <w:szCs w:val="18"/>
+        </w:rPr>
+        <w:t>$(</w:t>
+      </w:r>
+      <w:proofErr w:type="spellStart"/>
+      <w:r>
+        <w:rPr>
+          <w:rFonts w:ascii="Consolas" w:hAnsi="Consolas" w:cs="Segoe UI"/>
+          <w:color w:val="88C0D0"/>
+          <w:sz w:val="18"/>
+          <w:szCs w:val="18"/>
+        </w:rPr>
+        <w:t>terraform</w:t>
+      </w:r>
+      <w:proofErr w:type="spellEnd"/>
+      <w:r>
+        <w:rPr>
+          <w:rFonts w:ascii="Consolas" w:hAnsi="Consolas" w:cs="Segoe UI"/>
+          <w:color w:val="A3BE8C"/>
+          <w:sz w:val="18"/>
+          <w:szCs w:val="18"/>
+        </w:rPr>
+        <w:t xml:space="preserve"> output </w:t>
+      </w:r>
+      <w:r>
+        <w:rPr>
+          <w:rFonts w:ascii="Consolas" w:hAnsi="Consolas" w:cs="Segoe UI"/>
+          <w:color w:val="F8C762"/>
+          <w:sz w:val="18"/>
+          <w:szCs w:val="18"/>
+        </w:rPr>
+        <w:t>-</w:t>
+      </w:r>
+      <w:proofErr w:type="spellStart"/>
+      <w:r>
+        <w:rPr>
+          <w:rFonts w:ascii="Consolas" w:hAnsi="Consolas" w:cs="Segoe UI"/>
+          <w:color w:val="F8C762"/>
+          <w:sz w:val="18"/>
+          <w:szCs w:val="18"/>
+        </w:rPr>
+        <w:t>raw</w:t>
+      </w:r>
+      <w:proofErr w:type="spellEnd"/>
+      <w:r>
+        <w:rPr>
+          <w:rFonts w:ascii="Consolas" w:hAnsi="Consolas" w:cs="Segoe UI"/>
+          <w:color w:val="A3BE8C"/>
+          <w:sz w:val="18"/>
+          <w:szCs w:val="18"/>
+        </w:rPr>
+        <w:t xml:space="preserve"> </w:t>
+      </w:r>
+      <w:proofErr w:type="spellStart"/>
+      <w:r>
+        <w:rPr>
+          <w:rFonts w:ascii="Consolas" w:hAnsi="Consolas" w:cs="Segoe UI"/>
+          <w:color w:val="A3BE8C"/>
+          <w:sz w:val="18"/>
+          <w:szCs w:val="18"/>
+        </w:rPr>
+        <w:t>ecs_task_container_name</w:t>
+      </w:r>
+      <w:proofErr w:type="spellEnd"/>
+      <w:r>
+        <w:rPr>
+          <w:rFonts w:ascii="Consolas" w:hAnsi="Consolas" w:cs="Segoe UI"/>
+          <w:color w:val="ECEFF4"/>
+          <w:sz w:val="18"/>
+          <w:szCs w:val="18"/>
+        </w:rPr>
+        <w:t>)"</w:t>
+      </w:r>
+    </w:p>
+    <w:p>
+      <w:pPr>
+        <w:shd w:val="clear" w:color="auto" w:fill="1E2127"/>
+        <w:spacing w:line="300" w:lineRule="atLeast"/>
+        <w:rPr>
+          <w:rFonts w:ascii="Consolas" w:hAnsi="Consolas" w:cs="Segoe UI"/>
+          <w:color w:val="7B88A1"/>
+          <w:sz w:val="18"/>
+          <w:szCs w:val="18"/>
+        </w:rPr>
+      </w:pPr>
+      <w:proofErr w:type="spellStart"/>
+      <w:r>
+        <w:rPr>
+          <w:rFonts w:ascii="Consolas" w:hAnsi="Consolas" w:cs="Segoe UI"/>
+          <w:color w:val="88C0D0"/>
+          <w:sz w:val="18"/>
+          <w:szCs w:val="18"/>
+        </w:rPr>
+        <w:t>echo</w:t>
+      </w:r>
+      <w:proofErr w:type="spellEnd"/>
+      <w:r>
+        <w:rPr>
+          <w:rFonts w:ascii="Consolas" w:hAnsi="Consolas" w:cs="Segoe UI"/>
+          <w:color w:val="7B88A1"/>
+          <w:sz w:val="18"/>
+          <w:szCs w:val="18"/>
+        </w:rPr>
+        <w:t xml:space="preserve"> </w:t>
+      </w:r>
+      <w:r>
+        <w:rPr>
+          <w:rFonts w:ascii="Consolas" w:hAnsi="Consolas" w:cs="Segoe UI"/>
+          <w:color w:val="ECEFF4"/>
+          <w:sz w:val="18"/>
+          <w:szCs w:val="18"/>
+        </w:rPr>
+        <w:t>"</w:t>
+      </w:r>
+      <w:r>
+        <w:rPr>
+          <w:rFonts w:ascii="Consolas" w:hAnsi="Consolas" w:cs="Segoe UI"/>
+          <w:color w:val="A3BE8C"/>
+          <w:sz w:val="18"/>
+          <w:szCs w:val="18"/>
+        </w:rPr>
+        <w:t>ECS_SUBNET_IDS=</w:t>
+      </w:r>
+      <w:r>
+        <w:rPr>
+          <w:rFonts w:ascii="Consolas" w:hAnsi="Consolas" w:cs="Segoe UI"/>
+          <w:color w:val="ECEFF4"/>
+          <w:sz w:val="18"/>
+          <w:szCs w:val="18"/>
+        </w:rPr>
+        <w:t>$(</w:t>
+      </w:r>
+      <w:proofErr w:type="spellStart"/>
+      <w:r>
+        <w:rPr>
+          <w:rFonts w:ascii="Consolas" w:hAnsi="Consolas" w:cs="Segoe UI"/>
+          <w:color w:val="88C0D0"/>
+          <w:sz w:val="18"/>
+          <w:szCs w:val="18"/>
+        </w:rPr>
+        <w:t>terraform</w:t>
+      </w:r>
+      <w:proofErr w:type="spellEnd"/>
+      <w:r>
+        <w:rPr>
+          <w:rFonts w:ascii="Consolas" w:hAnsi="Consolas" w:cs="Segoe UI"/>
+          <w:color w:val="A3BE8C"/>
+          <w:sz w:val="18"/>
+          <w:szCs w:val="18"/>
+        </w:rPr>
+        <w:t xml:space="preserve"> output </w:t>
+      </w:r>
+      <w:r>
+        <w:rPr>
+          <w:rFonts w:ascii="Consolas" w:hAnsi="Consolas" w:cs="Segoe UI"/>
+          <w:color w:val="F8C762"/>
+          <w:sz w:val="18"/>
+          <w:szCs w:val="18"/>
+        </w:rPr>
+        <w:t>-</w:t>
+      </w:r>
+      <w:proofErr w:type="spellStart"/>
+      <w:r>
+        <w:rPr>
+          <w:rFonts w:ascii="Consolas" w:hAnsi="Consolas" w:cs="Segoe UI"/>
+          <w:color w:val="F8C762"/>
+          <w:sz w:val="18"/>
+          <w:szCs w:val="18"/>
+        </w:rPr>
+        <w:t>raw</w:t>
+      </w:r>
+      <w:proofErr w:type="spellEnd"/>
+      <w:r>
+        <w:rPr>
+          <w:rFonts w:ascii="Consolas" w:hAnsi="Consolas" w:cs="Segoe UI"/>
+          <w:color w:val="A3BE8C"/>
+          <w:sz w:val="18"/>
+          <w:szCs w:val="18"/>
+        </w:rPr>
+        <w:t xml:space="preserve"> </w:t>
+      </w:r>
+      <w:proofErr w:type="spellStart"/>
+      <w:r>
+        <w:rPr>
+          <w:rFonts w:ascii="Consolas" w:hAnsi="Consolas" w:cs="Segoe UI"/>
+          <w:color w:val="A3BE8C"/>
+          <w:sz w:val="18"/>
+          <w:szCs w:val="18"/>
+        </w:rPr>
+        <w:t>ecs_subnet_ids_csv</w:t>
+      </w:r>
+      <w:proofErr w:type="spellEnd"/>
+      <w:r>
+        <w:rPr>
+          <w:rFonts w:ascii="Consolas" w:hAnsi="Consolas" w:cs="Segoe UI"/>
+          <w:color w:val="ECEFF4"/>
+          <w:sz w:val="18"/>
+          <w:szCs w:val="18"/>
+        </w:rPr>
+        <w:t>)"</w:t>
+      </w:r>
+    </w:p>
+    <w:p>
+      <w:pPr>
+        <w:shd w:val="clear" w:color="auto" w:fill="1E2127"/>
+        <w:spacing w:line="300" w:lineRule="atLeast"/>
+        <w:rPr>
+          <w:rFonts w:ascii="Consolas" w:hAnsi="Consolas" w:cs="Segoe UI"/>
+          <w:color w:val="7B88A1"/>
+          <w:sz w:val="18"/>
+          <w:szCs w:val="18"/>
+        </w:rPr>
+      </w:pPr>
+      <w:proofErr w:type="spellStart"/>
+      <w:r>
+        <w:rPr>
+          <w:rFonts w:ascii="Consolas" w:hAnsi="Consolas" w:cs="Segoe UI"/>
+          <w:color w:val="88C0D0"/>
+          <w:sz w:val="18"/>
+          <w:szCs w:val="18"/>
+        </w:rPr>
+        <w:t>echo</w:t>
+      </w:r>
+      <w:proofErr w:type="spellEnd"/>
+      <w:r>
+        <w:rPr>
+          <w:rFonts w:ascii="Consolas" w:hAnsi="Consolas" w:cs="Segoe UI"/>
+          <w:color w:val="7B88A1"/>
+          <w:sz w:val="18"/>
+          <w:szCs w:val="18"/>
+        </w:rPr>
+        <w:t xml:space="preserve"> </w:t>
+      </w:r>
+      <w:r>
+        <w:rPr>
+          <w:rFonts w:ascii="Consolas" w:hAnsi="Consolas" w:cs="Segoe UI"/>
+          <w:color w:val="ECEFF4"/>
+          <w:sz w:val="18"/>
+          <w:szCs w:val="18"/>
+        </w:rPr>
+        <w:t>"</w:t>
+      </w:r>
+      <w:r>
+        <w:rPr>
+          <w:rFonts w:ascii="Consolas" w:hAnsi="Consolas" w:cs="Segoe UI"/>
+          <w:color w:val="A3BE8C"/>
+          <w:sz w:val="18"/>
+          <w:szCs w:val="18"/>
+        </w:rPr>
+        <w:t>ECS_SECURITY_GROUP_ID=</w:t>
+      </w:r>
+      <w:r>
+        <w:rPr>
+          <w:rFonts w:ascii="Consolas" w:hAnsi="Consolas" w:cs="Segoe UI"/>
+          <w:color w:val="ECEFF4"/>
+          <w:sz w:val="18"/>
+          <w:szCs w:val="18"/>
+        </w:rPr>
+        <w:t>$(</w:t>
+      </w:r>
+      <w:proofErr w:type="spellStart"/>
+      <w:r>
+        <w:rPr>
+          <w:rFonts w:ascii="Consolas" w:hAnsi="Consolas" w:cs="Segoe UI"/>
+          <w:color w:val="88C0D0"/>
+          <w:sz w:val="18"/>
+          <w:szCs w:val="18"/>
+        </w:rPr>
+        <w:t>terraform</w:t>
+      </w:r>
+      <w:proofErr w:type="spellEnd"/>
+      <w:r>
+        <w:rPr>
+          <w:rFonts w:ascii="Consolas" w:hAnsi="Consolas" w:cs="Segoe UI"/>
+          <w:color w:val="A3BE8C"/>
+          <w:sz w:val="18"/>
+          <w:szCs w:val="18"/>
+        </w:rPr>
+        <w:t xml:space="preserve"> output </w:t>
+      </w:r>
+      <w:r>
+        <w:rPr>
+          <w:rFonts w:ascii="Consolas" w:hAnsi="Consolas" w:cs="Segoe UI"/>
+          <w:color w:val="F8C762"/>
+          <w:sz w:val="18"/>
+          <w:szCs w:val="18"/>
+        </w:rPr>
+        <w:t>-</w:t>
+      </w:r>
+      <w:proofErr w:type="spellStart"/>
+      <w:r>
+        <w:rPr>
+          <w:rFonts w:ascii="Consolas" w:hAnsi="Consolas" w:cs="Segoe UI"/>
+          <w:color w:val="F8C762"/>
+          <w:sz w:val="18"/>
+          <w:szCs w:val="18"/>
+        </w:rPr>
+        <w:t>raw</w:t>
+      </w:r>
+      <w:proofErr w:type="spellEnd"/>
+      <w:r>
+        <w:rPr>
+          <w:rFonts w:ascii="Consolas" w:hAnsi="Consolas" w:cs="Segoe UI"/>
+          <w:color w:val="A3BE8C"/>
+          <w:sz w:val="18"/>
+          <w:szCs w:val="18"/>
+        </w:rPr>
+        <w:t xml:space="preserve"> </w:t>
+      </w:r>
+      <w:proofErr w:type="spellStart"/>
+      <w:r>
+        <w:rPr>
+          <w:rFonts w:ascii="Consolas" w:hAnsi="Consolas" w:cs="Segoe UI"/>
+          <w:color w:val="A3BE8C"/>
+          <w:sz w:val="18"/>
+          <w:szCs w:val="18"/>
+        </w:rPr>
+        <w:t>ecs_task_security_group_id</w:t>
+      </w:r>
+      <w:proofErr w:type="spellEnd"/>
+      <w:r>
+        <w:rPr>
+          <w:rFonts w:ascii="Consolas" w:hAnsi="Consolas" w:cs="Segoe UI"/>
+          <w:color w:val="ECEFF4"/>
+          <w:sz w:val="18"/>
+          <w:szCs w:val="18"/>
+        </w:rPr>
+        <w:t>)"</w:t>
+      </w:r>
+    </w:p>
+    <w:p>
+      <w:pPr>
+        <w:rPr>
+          <w:rFonts w:cstheme="minorHAnsi"/>
+          <w:u w:val="single"/>
+        </w:rPr>
+      </w:pPr>
+    </w:p>
+    <w:p>
+      <w:pPr>
+        <w:rPr>
+          <w:rFonts w:cstheme="minorHAnsi"/>
+        </w:rPr>
+      </w:pPr>
+      <w:r>
+        <w:rPr>
+          <w:rFonts w:cstheme="minorHAnsi"/>
+        </w:rPr>
+        <w:t>AWS_ROLE_ARN</w:t>
+      </w:r>
+    </w:p>
+    <w:p>
+      <w:pPr>
+        <w:rPr>
+          <w:rFonts w:cstheme="minorHAnsi"/>
+          <w:color w:val="4472C4" w:themeColor="accent1"/>
+        </w:rPr>
+      </w:pPr>
+      <w:proofErr w:type="spellStart"/>
+      <w:r>
+        <w:rPr>
+          <w:rFonts w:cstheme="minorHAnsi"/>
+          <w:color w:val="4472C4" w:themeColor="accent1"/>
+        </w:rPr>
+        <w:t>arn:aws:</w:t>
+      </w:r>
+      <w:proofErr w:type="gramStart"/>
+      <w:r>
+        <w:rPr>
+          <w:rFonts w:cstheme="minorHAnsi"/>
+          <w:color w:val="4472C4" w:themeColor="accent1"/>
+        </w:rPr>
+        <w:t>iam</w:t>
+      </w:r>
+      <w:proofErr w:type="spellEnd"/>
+      <w:r>
+        <w:rPr>
+          <w:rFonts w:cstheme="minorHAnsi"/>
+          <w:color w:val="4472C4" w:themeColor="accent1"/>
+        </w:rPr>
+        <w:t>::</w:t>
+      </w:r>
+      <w:proofErr w:type="gramEnd"/>
+      <w:r>
+        <w:rPr>
+          <w:rFonts w:cstheme="minorHAnsi"/>
+          <w:color w:val="4472C4" w:themeColor="accent1"/>
+        </w:rPr>
+        <w:t>813632940660:role/</w:t>
+      </w:r>
+      <w:proofErr w:type="spellStart"/>
+      <w:r>
+        <w:rPr>
+          <w:rFonts w:cstheme="minorHAnsi"/>
+          <w:color w:val="4472C4" w:themeColor="accent1"/>
+        </w:rPr>
+        <w:t>yolo-violence-prod-github-actions</w:t>
+      </w:r>
+      <w:proofErr w:type="spellEnd"/>
+    </w:p>
+    <w:p>
+      <w:pPr>
+        <w:rPr>
+          <w:rFonts w:cstheme="minorHAnsi"/>
+        </w:rPr>
+      </w:pPr>
+      <w:r>
+        <w:rPr>
+          <w:rFonts w:cstheme="minorHAnsi"/>
+        </w:rPr>
+        <w:t>ECR_REPOSITORY_NAME</w:t>
+      </w:r>
+    </w:p>
+    <w:p>
+      <w:pPr>
+        <w:rPr>
+          <w:rFonts w:ascii="Consolas" w:hAnsi="Consolas"/>
+          <w:color w:val="4472C4" w:themeColor="accent1"/>
+          <w:sz w:val="18"/>
+          <w:szCs w:val="18"/>
+        </w:rPr>
+      </w:pPr>
+      <w:proofErr w:type="spellStart"/>
+      <w:r>
+        <w:rPr>
+          <w:rFonts w:ascii="Consolas" w:hAnsi="Consolas"/>
+          <w:color w:val="4472C4" w:themeColor="accent1"/>
+          <w:sz w:val="18"/>
+          <w:szCs w:val="18"/>
+        </w:rPr>
+        <w:t>yolo</w:t>
+      </w:r>
+      <w:proofErr w:type="spellEnd"/>
+      <w:r>
+        <w:rPr>
+          <w:rFonts w:ascii="Consolas" w:hAnsi="Consolas"/>
+          <w:color w:val="4472C4" w:themeColor="accent1"/>
+          <w:sz w:val="18"/>
+          <w:szCs w:val="18"/>
+        </w:rPr>
+        <w:t>-</w:t>
+      </w:r>
+      <w:proofErr w:type="spellStart"/>
+      <w:r>
+        <w:rPr>
+          <w:rFonts w:ascii="Consolas" w:hAnsi="Consolas"/>
+          <w:color w:val="4472C4" w:themeColor="accent1"/>
+          <w:sz w:val="18"/>
+          <w:szCs w:val="18"/>
+        </w:rPr>
+        <w:t>violence</w:t>
+      </w:r>
+      <w:proofErr w:type="spellEnd"/>
+      <w:r>
+        <w:rPr>
+          <w:rFonts w:ascii="Consolas" w:hAnsi="Consolas"/>
+          <w:color w:val="4472C4" w:themeColor="accent1"/>
+          <w:sz w:val="18"/>
+          <w:szCs w:val="18"/>
+        </w:rPr>
+        <w:t>-</w:t>
+      </w:r>
+      <w:proofErr w:type="spellStart"/>
+      <w:r>
+        <w:rPr>
+          <w:rFonts w:ascii="Consolas" w:hAnsi="Consolas"/>
+          <w:color w:val="4472C4" w:themeColor="accent1"/>
+          <w:sz w:val="18"/>
+          <w:szCs w:val="18"/>
+        </w:rPr>
+        <w:t>prod</w:t>
+      </w:r>
+      <w:proofErr w:type="spellEnd"/>
+      <w:r>
+        <w:rPr>
+          <w:rFonts w:ascii="Consolas" w:hAnsi="Consolas"/>
+          <w:color w:val="4472C4" w:themeColor="accent1"/>
+          <w:sz w:val="18"/>
+          <w:szCs w:val="18"/>
+        </w:rPr>
+        <w:t>-app</w:t>
+      </w:r>
+    </w:p>
+    <w:p>
+      <w:pPr>
+        <w:rPr>
+          <w:rFonts w:cstheme="minorHAnsi"/>
+        </w:rPr>
+      </w:pPr>
+      <w:r>
+        <w:rPr>
+          <w:rFonts w:cstheme="minorHAnsi"/>
+        </w:rPr>
+        <w:t>ECS_CLUSTER_NAME</w:t>
+      </w:r>
+    </w:p>
+    <w:p>
+      <w:pPr>
+        <w:rPr>
+          <w:rFonts w:cstheme="minorHAnsi"/>
+          <w:color w:val="4472C4" w:themeColor="accent1"/>
+        </w:rPr>
+      </w:pPr>
+      <w:proofErr w:type="spellStart"/>
+      <w:r>
+        <w:rPr>
+          <w:rFonts w:cstheme="minorHAnsi"/>
+          <w:color w:val="4472C4" w:themeColor="accent1"/>
+        </w:rPr>
+        <w:t>yolo</w:t>
+      </w:r>
+      <w:proofErr w:type="spellEnd"/>
+      <w:r>
+        <w:rPr>
+          <w:rFonts w:cstheme="minorHAnsi"/>
+          <w:color w:val="4472C4" w:themeColor="accent1"/>
+        </w:rPr>
+        <w:t>-</w:t>
+      </w:r>
+      <w:proofErr w:type="spellStart"/>
+      <w:r>
+        <w:rPr>
+          <w:rFonts w:cstheme="minorHAnsi"/>
+          <w:color w:val="4472C4" w:themeColor="accent1"/>
+        </w:rPr>
+        <w:t>violence</w:t>
+      </w:r>
+      <w:proofErr w:type="spellEnd"/>
+      <w:r>
+        <w:rPr>
+          <w:rFonts w:cstheme="minorHAnsi"/>
+          <w:color w:val="4472C4" w:themeColor="accent1"/>
+        </w:rPr>
+        <w:t>-</w:t>
+      </w:r>
+      <w:proofErr w:type="spellStart"/>
+      <w:r>
+        <w:rPr>
+          <w:rFonts w:cstheme="minorHAnsi"/>
+          <w:color w:val="4472C4" w:themeColor="accent1"/>
+        </w:rPr>
+        <w:t>prod</w:t>
+      </w:r>
+      <w:proofErr w:type="spellEnd"/>
+      <w:r>
+        <w:rPr>
+          <w:rFonts w:cstheme="minorHAnsi"/>
+          <w:color w:val="4472C4" w:themeColor="accent1"/>
+        </w:rPr>
+        <w:t>-cluster</w:t>
+      </w:r>
+    </w:p>
+    <w:p>
+      <w:pPr>
+        <w:rPr>
+          <w:rFonts w:cstheme="minorHAnsi"/>
+        </w:rPr>
+      </w:pPr>
+      <w:r>
+        <w:rPr>
+          <w:rFonts w:cstheme="minorHAnsi"/>
+        </w:rPr>
+        <w:t>ECS_TASK_DEFINITION_FAMILY</w:t>
+      </w:r>
+    </w:p>
+    <w:p>
+      <w:pPr>
+        <w:rPr>
+          <w:rFonts w:cstheme="minorHAnsi"/>
+          <w:color w:val="4472C4" w:themeColor="accent1"/>
+        </w:rPr>
+      </w:pPr>
+      <w:proofErr w:type="spellStart"/>
+      <w:r>
+        <w:rPr>
+          <w:rFonts w:cstheme="minorHAnsi"/>
+          <w:color w:val="4472C4" w:themeColor="accent1"/>
+        </w:rPr>
+        <w:t>yolo-violence-prod-task</w:t>
+      </w:r>
+      <w:proofErr w:type="spellEnd"/>
+    </w:p>
+    <w:p>
+      <w:pPr>
+        <w:rPr>
+          <w:rFonts w:cstheme="minorHAnsi"/>
+        </w:rPr>
+      </w:pPr>
+    </w:p>
+    <w:p>
+      <w:pPr>
+        <w:rPr>
+          <w:rFonts w:cstheme="minorHAnsi"/>
+        </w:rPr>
+      </w:pPr>
+      <w:r>
+        <w:rPr>
+          <w:rFonts w:cstheme="minorHAnsi"/>
+        </w:rPr>
+        <w:lastRenderedPageBreak/>
+        <w:t>ECS_CONTAINER_NAME</w:t>
+      </w:r>
+    </w:p>
+    <w:p>
+      <w:pPr>
+        <w:rPr>
+          <w:rFonts w:cstheme="minorHAnsi"/>
+          <w:color w:val="4472C4" w:themeColor="accent1"/>
+        </w:rPr>
+      </w:pPr>
+      <w:proofErr w:type="spellStart"/>
+      <w:r>
+        <w:rPr>
+          <w:rFonts w:cstheme="minorHAnsi"/>
+          <w:color w:val="4472C4" w:themeColor="accent1"/>
+        </w:rPr>
+        <w:t>yolo-violence</w:t>
+      </w:r>
+      <w:proofErr w:type="spellEnd"/>
+    </w:p>
+    <w:p>
+      <w:pPr>
+        <w:rPr>
+          <w:rFonts w:cstheme="minorHAnsi"/>
+        </w:rPr>
+      </w:pPr>
+    </w:p>
+    <w:p>
+      <w:pPr>
+        <w:rPr>
+          <w:rFonts w:cstheme="minorHAnsi"/>
+        </w:rPr>
+      </w:pPr>
+      <w:r>
+        <w:rPr>
+          <w:rFonts w:cstheme="minorHAnsi"/>
+        </w:rPr>
+        <w:t>ECS_SUBNET_IDS</w:t>
+      </w:r>
+    </w:p>
+    <w:p>
+      <w:pPr>
+        <w:rPr>
+          <w:rFonts w:cstheme="minorHAnsi"/>
+          <w:color w:val="4472C4" w:themeColor="accent1"/>
+        </w:rPr>
+      </w:pPr>
+      <w:r>
+        <w:rPr>
+          <w:rFonts w:cstheme="minorHAnsi"/>
+          <w:color w:val="4472C4" w:themeColor="accent1"/>
+        </w:rPr>
+        <w:t>subnet-0dbae3fa</w:t>
+      </w:r>
+      <w:proofErr w:type="gramStart"/>
+      <w:r>
+        <w:rPr>
+          <w:rFonts w:cstheme="minorHAnsi"/>
+          <w:color w:val="4472C4" w:themeColor="accent1"/>
+        </w:rPr>
+        <w:t>095281588,subnet</w:t>
+      </w:r>
+      <w:proofErr w:type="gramEnd"/>
+      <w:r>
+        <w:rPr>
+          <w:rFonts w:cstheme="minorHAnsi"/>
+          <w:color w:val="4472C4" w:themeColor="accent1"/>
+        </w:rPr>
+        <w:t>-02d7eb853e18474e2</w:t>
+      </w:r>
+    </w:p>
+    <w:p>
+      <w:pPr>
+        <w:rPr>
+          <w:rFonts w:cstheme="minorHAnsi"/>
+        </w:rPr>
+      </w:pPr>
+    </w:p>
+    <w:p>
+      <w:pPr>
+        <w:rPr>
+          <w:rFonts w:cstheme="minorHAnsi"/>
+        </w:rPr>
+      </w:pPr>
+      <w:r>
+        <w:rPr>
+          <w:rFonts w:cstheme="minorHAnsi"/>
+        </w:rPr>
+        <w:t>ECS_SECURITY_GROUP_ID</w:t>
+      </w:r>
+    </w:p>
+    <w:p>
+      <w:pPr>
+        <w:rPr>
+          <w:rFonts w:cstheme="minorHAnsi"/>
+          <w:color w:val="4472C4" w:themeColor="accent1"/>
+        </w:rPr>
+      </w:pPr>
+      <w:r>
+        <w:rPr>
+          <w:rFonts w:cstheme="minorHAnsi"/>
+          <w:color w:val="4472C4" w:themeColor="accent1"/>
+        </w:rPr>
+        <w:t>sg-0e6cca6772ed01959</w:t>
+      </w:r>
+    </w:p>
     <w:sectPr>
       <w:pgSz w:w="11906" w:h="16838"/>
       <w:pgMar w:top="1417" w:right="1701" w:bottom="1417" w:left="1701" w:header="708" w:footer="708" w:gutter="0"/>
@@ -138,6 +3346,127 @@
     </w:sectPr>
   </w:body>
 </w:document>
+</file>
+
+<file path=word/numbering.xml><?xml version="1.0" encoding="utf-8"?>
+<w:numbering xmlns:wpc="http://schemas.microsoft.com/office/word/2010/wordprocessingCanvas" xmlns:cx="http://schemas.microsoft.com/office/drawing/2014/chartex" xmlns:cx1="http://schemas.microsoft.com/office/drawing/2015/9/8/chartex" xmlns:cx2="http://schemas.microsoft.com/office/drawing/2015/10/21/chartex" xmlns:cx3="http://schemas.microsoft.com/office/drawing/2016/5/9/chartex" xmlns:cx4="http://schemas.microsoft.com/office/drawing/2016/5/10/chartex" xmlns:cx5="http://schemas.microsoft.com/office/drawing/2016/5/11/chartex" xmlns:cx6="http://schemas.microsoft.com/office/drawing/2016/5/12/chartex" xmlns:cx7="http://schemas.microsoft.com/office/drawing/2016/5/13/chartex" xmlns:cx8="http://schemas.microsoft.com/office/drawing/2016/5/14/chartex" xmlns:mc="http://schemas.openxmlformats.org/markup-compatibility/2006" xmlns:aink="http://schemas.microsoft.com/office/drawing/2016/ink" xmlns:am3d="http://schemas.microsoft.com/office/drawing/2017/model3d" xmlns:o="urn:schemas-microsoft-com:office:office" xmlns:r="http://schemas.openxmlformats.org/officeDocument/2006/relationships" xmlns:m="http://schemas.openxmlformats.org/officeDocument/2006/math" xmlns:v="urn:schemas-microsoft-com:vml" xmlns:wp14="http://schemas.microsoft.com/office/word/2010/wordprocessingDrawing" xmlns:wp="http://schemas.openxmlformats.org/drawingml/2006/wordprocessingDrawing" xmlns:w10="urn:schemas-microsoft-com:office:word" xmlns:w="http://schemas.openxmlformats.org/wordprocessingml/2006/main" xmlns:w14="http://schemas.microsoft.com/office/word/2010/wordml" xmlns:w15="http://schemas.microsoft.com/office/word/2012/wordml" xmlns:w16cex="http://schemas.microsoft.com/office/word/2018/wordml/cex" xmlns:w16cid="http://schemas.microsoft.com/office/word/2016/wordml/cid" xmlns:w16="http://schemas.microsoft.com/office/word/2018/wordml" xmlns:w16sdtdh="http://schemas.microsoft.com/office/word/2020/wordml/sdtdatahash" xmlns:w16se="http://schemas.microsoft.com/office/word/2015/wordml/symex" xmlns:wpg="http://schemas.microsoft.com/office/word/2010/wordprocessingGroup" xmlns:wpi="http://schemas.microsoft.com/office/word/2010/wordprocessingInk" xmlns:wne="http://schemas.microsoft.com/office/word/2006/wordml" xmlns:wps="http://schemas.microsoft.com/office/word/2010/wordprocessingShape" mc:Ignorable="w14 w15 w16se w16cid w16 w16cex w16sdtdh wp14">
+  <w:abstractNum w:abstractNumId="0" w15:restartNumberingAfterBreak="0">
+    <w:nsid w:val="057928B2"/>
+    <w:multiLevelType w:val="multilevel"/>
+    <w:tmpl w:val="C2C0B49E"/>
+    <w:lvl w:ilvl="0">
+      <w:start w:val="1"/>
+      <w:numFmt w:val="decimal"/>
+      <w:lvlText w:val="%1."/>
+      <w:lvlJc w:val="left"/>
+      <w:pPr>
+        <w:tabs>
+          <w:tab w:val="num" w:pos="720"/>
+        </w:tabs>
+        <w:ind w:left="720" w:hanging="360"/>
+      </w:pPr>
+    </w:lvl>
+    <w:lvl w:ilvl="1" w:tentative="1">
+      <w:start w:val="1"/>
+      <w:numFmt w:val="decimal"/>
+      <w:lvlText w:val="%2."/>
+      <w:lvlJc w:val="left"/>
+      <w:pPr>
+        <w:tabs>
+          <w:tab w:val="num" w:pos="1440"/>
+        </w:tabs>
+        <w:ind w:left="1440" w:hanging="360"/>
+      </w:pPr>
+    </w:lvl>
+    <w:lvl w:ilvl="2" w:tentative="1">
+      <w:start w:val="1"/>
+      <w:numFmt w:val="decimal"/>
+      <w:lvlText w:val="%3."/>
+      <w:lvlJc w:val="left"/>
+      <w:pPr>
+        <w:tabs>
+          <w:tab w:val="num" w:pos="2160"/>
+        </w:tabs>
+        <w:ind w:left="2160" w:hanging="360"/>
+      </w:pPr>
+    </w:lvl>
+    <w:lvl w:ilvl="3" w:tentative="1">
+      <w:start w:val="1"/>
+      <w:numFmt w:val="decimal"/>
+      <w:lvlText w:val="%4."/>
+      <w:lvlJc w:val="left"/>
+      <w:pPr>
+        <w:tabs>
+          <w:tab w:val="num" w:pos="2880"/>
+        </w:tabs>
+        <w:ind w:left="2880" w:hanging="360"/>
+      </w:pPr>
+    </w:lvl>
+    <w:lvl w:ilvl="4" w:tentative="1">
+      <w:start w:val="1"/>
+      <w:numFmt w:val="decimal"/>
+      <w:lvlText w:val="%5."/>
+      <w:lvlJc w:val="left"/>
+      <w:pPr>
+        <w:tabs>
+          <w:tab w:val="num" w:pos="3600"/>
+        </w:tabs>
+        <w:ind w:left="3600" w:hanging="360"/>
+      </w:pPr>
+    </w:lvl>
+    <w:lvl w:ilvl="5" w:tentative="1">
+      <w:start w:val="1"/>
+      <w:numFmt w:val="decimal"/>
+      <w:lvlText w:val="%6."/>
+      <w:lvlJc w:val="left"/>
+      <w:pPr>
+        <w:tabs>
+          <w:tab w:val="num" w:pos="4320"/>
+        </w:tabs>
+        <w:ind w:left="4320" w:hanging="360"/>
+      </w:pPr>
+    </w:lvl>
+    <w:lvl w:ilvl="6" w:tentative="1">
+      <w:start w:val="1"/>
+      <w:numFmt w:val="decimal"/>
+      <w:lvlText w:val="%7."/>
+      <w:lvlJc w:val="left"/>
+      <w:pPr>
+        <w:tabs>
+          <w:tab w:val="num" w:pos="5040"/>
+        </w:tabs>
+        <w:ind w:left="5040" w:hanging="360"/>
+      </w:pPr>
+    </w:lvl>
+    <w:lvl w:ilvl="7" w:tentative="1">
+      <w:start w:val="1"/>
+      <w:numFmt w:val="decimal"/>
+      <w:lvlText w:val="%8."/>
+      <w:lvlJc w:val="left"/>
+      <w:pPr>
+        <w:tabs>
+          <w:tab w:val="num" w:pos="5760"/>
+        </w:tabs>
+        <w:ind w:left="5760" w:hanging="360"/>
+      </w:pPr>
+    </w:lvl>
+    <w:lvl w:ilvl="8" w:tentative="1">
+      <w:start w:val="1"/>
+      <w:numFmt w:val="decimal"/>
+      <w:lvlText w:val="%9."/>
+      <w:lvlJc w:val="left"/>
+      <w:pPr>
+        <w:tabs>
+          <w:tab w:val="num" w:pos="6480"/>
+        </w:tabs>
+        <w:ind w:left="6480" w:hanging="360"/>
+      </w:pPr>
+    </w:lvl>
+  </w:abstractNum>
+  <w:num w:numId="1">
+    <w:abstractNumId w:val="0"/>
+  </w:num>
+</w:numbering>
 </file>
 
 <file path=word/styles.xml><?xml version="1.0" encoding="utf-8"?>
@@ -263,6 +3592,7 @@
     <w:lsdException w:name="HTML Sample" w:semiHidden="1" w:unhideWhenUsed="1"/>
     <w:lsdException w:name="HTML Typewriter" w:semiHidden="1" w:unhideWhenUsed="1"/>
     <w:lsdException w:name="HTML Variable" w:semiHidden="1" w:unhideWhenUsed="1"/>
+    <w:lsdException w:name="Normal Table" w:semiHidden="1" w:unhideWhenUsed="1"/>
     <w:lsdException w:name="annotation subject" w:semiHidden="1" w:unhideWhenUsed="1"/>
     <w:lsdException w:name="No List" w:semiHidden="1" w:unhideWhenUsed="1"/>
     <w:lsdException w:name="Outline List 1" w:semiHidden="1" w:unhideWhenUsed="1"/>
@@ -309,8 +3639,10 @@
     <w:lsdException w:name="Table Subtle 2" w:semiHidden="1" w:unhideWhenUsed="1"/>
     <w:lsdException w:name="Table Web 1" w:semiHidden="1" w:unhideWhenUsed="1"/>
     <w:lsdException w:name="Table Web 2" w:semiHidden="1" w:unhideWhenUsed="1"/>
+    <w:lsdException w:name="Table Web 3" w:semiHidden="1" w:unhideWhenUsed="1"/>
     <w:lsdException w:name="Balloon Text" w:semiHidden="1" w:unhideWhenUsed="1"/>
     <w:lsdException w:name="Table Grid" w:uiPriority="39"/>
+    <w:lsdException w:name="Table Theme" w:semiHidden="1" w:unhideWhenUsed="1"/>
     <w:lsdException w:name="Placeholder Text" w:semiHidden="1"/>
     <w:lsdException w:name="No Spacing" w:uiPriority="1" w:qFormat="1"/>
     <w:lsdException w:name="Light Shading" w:uiPriority="60"/>
@@ -557,6 +3889,52 @@
       <w:szCs w:val="32"/>
     </w:rPr>
   </w:style>
+  <w:style w:type="paragraph" w:styleId="Ttulo2">
+    <w:name w:val="heading 2"/>
+    <w:basedOn w:val="Normal"/>
+    <w:next w:val="Normal"/>
+    <w:link w:val="Ttulo2Char"/>
+    <w:uiPriority w:val="9"/>
+    <w:semiHidden/>
+    <w:unhideWhenUsed/>
+    <w:qFormat/>
+    <w:rsid w:val="00AE6A11"/>
+    <w:pPr>
+      <w:keepNext/>
+      <w:keepLines/>
+      <w:spacing w:before="40" w:after="0"/>
+      <w:outlineLvl w:val="1"/>
+    </w:pPr>
+    <w:rPr>
+      <w:rFonts w:asciiTheme="majorHAnsi" w:eastAsiaTheme="majorEastAsia" w:hAnsiTheme="majorHAnsi" w:cstheme="majorBidi"/>
+      <w:color w:val="2F5496" w:themeColor="accent1" w:themeShade="BF"/>
+      <w:sz w:val="26"/>
+      <w:szCs w:val="26"/>
+    </w:rPr>
+  </w:style>
+  <w:style w:type="paragraph" w:styleId="Ttulo3">
+    <w:name w:val="heading 3"/>
+    <w:basedOn w:val="Normal"/>
+    <w:next w:val="Normal"/>
+    <w:link w:val="Ttulo3Char"/>
+    <w:uiPriority w:val="9"/>
+    <w:semiHidden/>
+    <w:unhideWhenUsed/>
+    <w:qFormat/>
+    <w:rsid w:val="00B7017A"/>
+    <w:pPr>
+      <w:keepNext/>
+      <w:keepLines/>
+      <w:spacing w:before="40" w:after="0"/>
+      <w:outlineLvl w:val="2"/>
+    </w:pPr>
+    <w:rPr>
+      <w:rFonts w:asciiTheme="majorHAnsi" w:eastAsiaTheme="majorEastAsia" w:hAnsiTheme="majorHAnsi" w:cstheme="majorBidi"/>
+      <w:color w:val="1F3763" w:themeColor="accent1" w:themeShade="7F"/>
+      <w:sz w:val="24"/>
+      <w:szCs w:val="24"/>
+    </w:rPr>
+  </w:style>
   <w:style w:type="character" w:default="1" w:styleId="Fontepargpadro">
     <w:name w:val="Default Paragraph Font"/>
     <w:uiPriority w:val="1"/>
@@ -595,6 +3973,83 @@
       <w:color w:val="2F5496" w:themeColor="accent1" w:themeShade="BF"/>
       <w:sz w:val="32"/>
       <w:szCs w:val="32"/>
+    </w:rPr>
+  </w:style>
+  <w:style w:type="character" w:customStyle="1" w:styleId="Ttulo2Char">
+    <w:name w:val="Título 2 Char"/>
+    <w:basedOn w:val="Fontepargpadro"/>
+    <w:link w:val="Ttulo2"/>
+    <w:uiPriority w:val="9"/>
+    <w:semiHidden/>
+    <w:rsid w:val="00AE6A11"/>
+    <w:rPr>
+      <w:rFonts w:asciiTheme="majorHAnsi" w:eastAsiaTheme="majorEastAsia" w:hAnsiTheme="majorHAnsi" w:cstheme="majorBidi"/>
+      <w:color w:val="2F5496" w:themeColor="accent1" w:themeShade="BF"/>
+      <w:sz w:val="26"/>
+      <w:szCs w:val="26"/>
+    </w:rPr>
+  </w:style>
+  <w:style w:type="character" w:styleId="CdigoHTML">
+    <w:name w:val="HTML Code"/>
+    <w:basedOn w:val="Fontepargpadro"/>
+    <w:uiPriority w:val="99"/>
+    <w:semiHidden/>
+    <w:unhideWhenUsed/>
+    <w:rsid w:val="00AE6A11"/>
+    <w:rPr>
+      <w:rFonts w:ascii="Courier New" w:eastAsia="Times New Roman" w:hAnsi="Courier New" w:cs="Courier New"/>
+      <w:sz w:val="20"/>
+      <w:szCs w:val="20"/>
+    </w:rPr>
+  </w:style>
+  <w:style w:type="paragraph" w:customStyle="1" w:styleId="py-1">
+    <w:name w:val="py-1"/>
+    <w:basedOn w:val="Normal"/>
+    <w:rsid w:val="00AE6A11"/>
+    <w:pPr>
+      <w:spacing w:before="100" w:beforeAutospacing="1" w:after="100" w:afterAutospacing="1" w:line="240" w:lineRule="auto"/>
+    </w:pPr>
+    <w:rPr>
+      <w:rFonts w:ascii="Times New Roman" w:eastAsia="Times New Roman" w:hAnsi="Times New Roman" w:cs="Times New Roman"/>
+      <w:sz w:val="24"/>
+      <w:szCs w:val="24"/>
+      <w:lang w:eastAsia="pt-BR"/>
+    </w:rPr>
+  </w:style>
+  <w:style w:type="paragraph" w:styleId="NormalWeb">
+    <w:name w:val="Normal (Web)"/>
+    <w:basedOn w:val="Normal"/>
+    <w:uiPriority w:val="99"/>
+    <w:semiHidden/>
+    <w:unhideWhenUsed/>
+    <w:rsid w:val="00AE6A11"/>
+    <w:pPr>
+      <w:spacing w:before="100" w:beforeAutospacing="1" w:after="100" w:afterAutospacing="1" w:line="240" w:lineRule="auto"/>
+    </w:pPr>
+    <w:rPr>
+      <w:rFonts w:ascii="Times New Roman" w:eastAsia="Times New Roman" w:hAnsi="Times New Roman" w:cs="Times New Roman"/>
+      <w:sz w:val="24"/>
+      <w:szCs w:val="24"/>
+      <w:lang w:eastAsia="pt-BR"/>
+    </w:rPr>
+  </w:style>
+  <w:style w:type="character" w:customStyle="1" w:styleId="font-semibold">
+    <w:name w:val="font-semibold"/>
+    <w:basedOn w:val="Fontepargpadro"/>
+    <w:rsid w:val="00AE6A11"/>
+  </w:style>
+  <w:style w:type="character" w:customStyle="1" w:styleId="Ttulo3Char">
+    <w:name w:val="Título 3 Char"/>
+    <w:basedOn w:val="Fontepargpadro"/>
+    <w:link w:val="Ttulo3"/>
+    <w:uiPriority w:val="9"/>
+    <w:semiHidden/>
+    <w:rsid w:val="00B7017A"/>
+    <w:rPr>
+      <w:rFonts w:asciiTheme="majorHAnsi" w:eastAsiaTheme="majorEastAsia" w:hAnsiTheme="majorHAnsi" w:cstheme="majorBidi"/>
+      <w:color w:val="1F3763" w:themeColor="accent1" w:themeShade="7F"/>
+      <w:sz w:val="24"/>
+      <w:szCs w:val="24"/>
     </w:rPr>
   </w:style>
 </w:styles>

</xml_diff>